<commit_message>
Update application code, services, and IQOQDQ documents
</commit_message>
<xml_diff>
--- a/IQOQDQ/OQ Alarm/XXXXX_10_OQ_Alarms_GMP_2025-01-02_en.docx
+++ b/IQOQDQ/OQ Alarm/XXXXX_10_OQ_Alarms_GMP_2025-01-02_en.docx
@@ -1,6 +1,6 @@
 
 <file path=word/document.xml><?xml version="1.0" encoding="utf-8"?>
-<w:document xmlns:wpc="http://schemas.microsoft.com/office/word/2010/wordprocessingCanvas" xmlns:cx="http://schemas.microsoft.com/office/drawing/2014/chartex" xmlns:cx1="http://schemas.microsoft.com/office/drawing/2015/9/8/chartex" xmlns:cx2="http://schemas.microsoft.com/office/drawing/2015/10/21/chartex" xmlns:cx3="http://schemas.microsoft.com/office/drawing/2016/5/9/chartex" xmlns:cx4="http://schemas.microsoft.com/office/drawing/2016/5/10/chartex" xmlns:cx5="http://schemas.microsoft.com/office/drawing/2016/5/11/chartex" xmlns:cx6="http://schemas.microsoft.com/office/drawing/2016/5/12/chartex" xmlns:cx7="http://schemas.microsoft.com/office/drawing/2016/5/13/chartex" xmlns:cx8="http://schemas.microsoft.com/office/drawing/2016/5/14/chartex" xmlns:mc="http://schemas.openxmlformats.org/markup-compatibility/2006" xmlns:aink="http://schemas.microsoft.com/office/drawing/2016/ink" xmlns:am3d="http://schemas.microsoft.com/office/drawing/2017/model3d" xmlns:o="urn:schemas-microsoft-com:office:office" xmlns:oel="http://schemas.microsoft.com/office/2019/extlst" xmlns:r="http://schemas.openxmlformats.org/officeDocument/2006/relationships" xmlns:m="http://schemas.openxmlformats.org/officeDocument/2006/math" xmlns:v="urn:schemas-microsoft-com:vml" xmlns:wp14="http://schemas.microsoft.com/office/word/2010/wordprocessingDrawing" xmlns:wp="http://schemas.openxmlformats.org/drawingml/2006/wordprocessingDrawing" xmlns:w10="urn:schemas-microsoft-com:office:word" xmlns:w="http://schemas.openxmlformats.org/wordprocessingml/2006/main" xmlns:w14="http://schemas.microsoft.com/office/word/2010/wordml" xmlns:w15="http://schemas.microsoft.com/office/word/2012/wordml" xmlns:w16cex="http://schemas.microsoft.com/office/word/2018/wordml/cex" xmlns:w16cid="http://schemas.microsoft.com/office/word/2016/wordml/cid" xmlns:w16="http://schemas.microsoft.com/office/word/2018/wordml" xmlns:w16sdtdh="http://schemas.microsoft.com/office/word/2020/wordml/sdtdatahash" xmlns:w16se="http://schemas.microsoft.com/office/word/2015/wordml/symex" xmlns:wpg="http://schemas.microsoft.com/office/word/2010/wordprocessingGroup" xmlns:wpi="http://schemas.microsoft.com/office/word/2010/wordprocessingInk" xmlns:wne="http://schemas.microsoft.com/office/word/2006/wordml" xmlns:wps="http://schemas.microsoft.com/office/word/2010/wordprocessingShape" mc:Ignorable="w14 w15 w16se w16cid w16 w16cex w16sdtdh wp14">
+<w:document xmlns:wpc="http://schemas.microsoft.com/office/word/2010/wordprocessingCanvas" xmlns:cx="http://schemas.microsoft.com/office/drawing/2014/chartex" xmlns:cx1="http://schemas.microsoft.com/office/drawing/2015/9/8/chartex" xmlns:cx2="http://schemas.microsoft.com/office/drawing/2015/10/21/chartex" xmlns:cx3="http://schemas.microsoft.com/office/drawing/2016/5/9/chartex" xmlns:cx4="http://schemas.microsoft.com/office/drawing/2016/5/10/chartex" xmlns:cx5="http://schemas.microsoft.com/office/drawing/2016/5/11/chartex" xmlns:cx6="http://schemas.microsoft.com/office/drawing/2016/5/12/chartex" xmlns:cx7="http://schemas.microsoft.com/office/drawing/2016/5/13/chartex" xmlns:cx8="http://schemas.microsoft.com/office/drawing/2016/5/14/chartex" xmlns:mc="http://schemas.openxmlformats.org/markup-compatibility/2006" xmlns:aink="http://schemas.microsoft.com/office/drawing/2016/ink" xmlns:am3d="http://schemas.microsoft.com/office/drawing/2017/model3d" xmlns:o="urn:schemas-microsoft-com:office:office" xmlns:oel="http://schemas.microsoft.com/office/2019/extlst" xmlns:r="http://schemas.openxmlformats.org/officeDocument/2006/relationships" xmlns:m="http://schemas.openxmlformats.org/officeDocument/2006/math" xmlns:v="urn:schemas-microsoft-com:vml" xmlns:wp14="http://schemas.microsoft.com/office/word/2010/wordprocessingDrawing" xmlns:wp="http://schemas.openxmlformats.org/drawingml/2006/wordprocessingDrawing" xmlns:w10="urn:schemas-microsoft-com:office:word" xmlns:w="http://schemas.openxmlformats.org/wordprocessingml/2006/main" xmlns:w14="http://schemas.microsoft.com/office/word/2010/wordml" xmlns:w15="http://schemas.microsoft.com/office/word/2012/wordml" xmlns:w16cex="http://schemas.microsoft.com/office/word/2018/wordml/cex" xmlns:w16cid="http://schemas.microsoft.com/office/word/2016/wordml/cid" xmlns:w16="http://schemas.microsoft.com/office/word/2018/wordml" xmlns:w16du="http://schemas.microsoft.com/office/word/2023/wordml/word16du" xmlns:w16sdtdh="http://schemas.microsoft.com/office/word/2020/wordml/sdtdatahash" xmlns:w16sdtfl="http://schemas.microsoft.com/office/word/2024/wordml/sdtformatlock" xmlns:w16se="http://schemas.microsoft.com/office/word/2015/wordml/symex" xmlns:wpg="http://schemas.microsoft.com/office/word/2010/wordprocessingGroup" xmlns:wpi="http://schemas.microsoft.com/office/word/2010/wordprocessingInk" xmlns:wne="http://schemas.microsoft.com/office/word/2006/wordml" xmlns:wps="http://schemas.microsoft.com/office/word/2010/wordprocessingShape" mc:Ignorable="w14 w15 w16se w16cid w16 w16cex w16sdtdh w16sdtfl w16du wp14">
   <w:body>
     <w:p>
       <w:pPr>
@@ -21,7 +21,7 @@
           <w:b/>
           <w:sz w:val="32"/>
         </w:rPr>
-        <w:t>IWK Verpackungstechnik GmbH</w:t>
+        <w:t>IWK (Thailand) Limited.</w:t>
       </w:r>
     </w:p>
     <w:p>
@@ -531,7 +531,7 @@
     </w:p>
     <w:p>
       <w:pPr>
-        <w:pStyle w:val="Verzeichnis1"/>
+        <w:pStyle w:val="TOC1"/>
         <w:tabs>
           <w:tab w:val="left" w:pos="1701"/>
         </w:tabs>
@@ -633,7 +633,7 @@
     </w:p>
     <w:p>
       <w:pPr>
-        <w:pStyle w:val="Verzeichnis1"/>
+        <w:pStyle w:val="TOC1"/>
         <w:tabs>
           <w:tab w:val="left" w:pos="1701"/>
         </w:tabs>
@@ -715,7 +715,7 @@
     </w:p>
     <w:p>
       <w:pPr>
-        <w:pStyle w:val="Verzeichnis2"/>
+        <w:pStyle w:val="TOC2"/>
         <w:tabs>
           <w:tab w:val="left" w:pos="2268"/>
         </w:tabs>
@@ -797,7 +797,7 @@
     </w:p>
     <w:p>
       <w:pPr>
-        <w:pStyle w:val="Verzeichnis2"/>
+        <w:pStyle w:val="TOC2"/>
         <w:tabs>
           <w:tab w:val="left" w:pos="2268"/>
         </w:tabs>
@@ -879,7 +879,7 @@
     </w:p>
     <w:p>
       <w:pPr>
-        <w:pStyle w:val="Verzeichnis2"/>
+        <w:pStyle w:val="TOC2"/>
         <w:tabs>
           <w:tab w:val="left" w:pos="2268"/>
         </w:tabs>
@@ -961,7 +961,7 @@
     </w:p>
     <w:p>
       <w:pPr>
-        <w:pStyle w:val="Verzeichnis2"/>
+        <w:pStyle w:val="TOC2"/>
         <w:tabs>
           <w:tab w:val="left" w:pos="2268"/>
         </w:tabs>
@@ -1043,7 +1043,7 @@
     </w:p>
     <w:p>
       <w:pPr>
-        <w:pStyle w:val="Verzeichnis2"/>
+        <w:pStyle w:val="TOC2"/>
         <w:tabs>
           <w:tab w:val="left" w:pos="2268"/>
         </w:tabs>
@@ -1125,7 +1125,7 @@
     </w:p>
     <w:p>
       <w:pPr>
-        <w:pStyle w:val="Verzeichnis3"/>
+        <w:pStyle w:val="TOC3"/>
         <w:tabs>
           <w:tab w:val="left" w:pos="3005"/>
         </w:tabs>
@@ -1218,7 +1218,7 @@
     </w:p>
     <w:p>
       <w:pPr>
-        <w:pStyle w:val="Verzeichnis3"/>
+        <w:pStyle w:val="TOC3"/>
         <w:tabs>
           <w:tab w:val="left" w:pos="3005"/>
         </w:tabs>
@@ -1311,7 +1311,7 @@
     </w:p>
     <w:p>
       <w:pPr>
-        <w:pStyle w:val="Verzeichnis1"/>
+        <w:pStyle w:val="TOC1"/>
         <w:tabs>
           <w:tab w:val="left" w:pos="1701"/>
         </w:tabs>
@@ -1392,7 +1392,7 @@
     </w:p>
     <w:p>
       <w:pPr>
-        <w:pStyle w:val="Verzeichnis1"/>
+        <w:pStyle w:val="TOC1"/>
         <w:tabs>
           <w:tab w:val="left" w:pos="1701"/>
         </w:tabs>
@@ -1473,7 +1473,7 @@
     </w:p>
     <w:p>
       <w:pPr>
-        <w:pStyle w:val="Verzeichnis2"/>
+        <w:pStyle w:val="TOC2"/>
         <w:tabs>
           <w:tab w:val="left" w:pos="2268"/>
         </w:tabs>
@@ -1554,7 +1554,7 @@
     </w:p>
     <w:p>
       <w:pPr>
-        <w:pStyle w:val="Verzeichnis2"/>
+        <w:pStyle w:val="TOC2"/>
         <w:tabs>
           <w:tab w:val="left" w:pos="2268"/>
         </w:tabs>
@@ -1635,7 +1635,7 @@
     </w:p>
     <w:p>
       <w:pPr>
-        <w:pStyle w:val="Verzeichnis1"/>
+        <w:pStyle w:val="TOC1"/>
         <w:tabs>
           <w:tab w:val="left" w:pos="900"/>
         </w:tabs>
@@ -1654,7 +1654,7 @@
     </w:p>
     <w:p>
       <w:pPr>
-        <w:pStyle w:val="berschrift1"/>
+        <w:pStyle w:val="Heading1"/>
         <w:tabs>
           <w:tab w:val="num" w:pos="567"/>
         </w:tabs>
@@ -1896,7 +1896,7 @@
     </w:tbl>
     <w:p>
       <w:pPr>
-        <w:pStyle w:val="Verzeichnis1"/>
+        <w:pStyle w:val="TOC1"/>
         <w:tabs>
           <w:tab w:val="left" w:pos="900"/>
         </w:tabs>
@@ -1913,7 +1913,7 @@
     </w:p>
     <w:p>
       <w:pPr>
-        <w:pStyle w:val="berschrift1"/>
+        <w:pStyle w:val="Heading1"/>
         <w:tabs>
           <w:tab w:val="num" w:pos="567"/>
         </w:tabs>
@@ -1939,7 +1939,7 @@
     </w:p>
     <w:p>
       <w:pPr>
-        <w:pStyle w:val="berschrift2"/>
+        <w:pStyle w:val="Heading2"/>
         <w:numPr>
           <w:ilvl w:val="1"/>
           <w:numId w:val="3"/>
@@ -1990,7 +1990,7 @@
     </w:p>
     <w:p>
       <w:pPr>
-        <w:pStyle w:val="berschrift2"/>
+        <w:pStyle w:val="Heading2"/>
         <w:numPr>
           <w:ilvl w:val="1"/>
           <w:numId w:val="3"/>
@@ -2032,7 +2032,7 @@
     </w:p>
     <w:p>
       <w:pPr>
-        <w:pStyle w:val="berschrift2"/>
+        <w:pStyle w:val="Heading2"/>
         <w:numPr>
           <w:ilvl w:val="1"/>
           <w:numId w:val="3"/>
@@ -2085,7 +2085,7 @@
     </w:p>
     <w:p>
       <w:pPr>
-        <w:pStyle w:val="berschrift2"/>
+        <w:pStyle w:val="Heading2"/>
         <w:numPr>
           <w:ilvl w:val="1"/>
           <w:numId w:val="3"/>
@@ -2159,7 +2159,7 @@
     </w:p>
     <w:p>
       <w:pPr>
-        <w:pStyle w:val="berschrift2"/>
+        <w:pStyle w:val="Heading2"/>
         <w:numPr>
           <w:ilvl w:val="1"/>
           <w:numId w:val="3"/>
@@ -2184,7 +2184,7 @@
     </w:p>
     <w:p>
       <w:pPr>
-        <w:pStyle w:val="berschrift3"/>
+        <w:pStyle w:val="Heading3"/>
         <w:numPr>
           <w:ilvl w:val="2"/>
           <w:numId w:val="3"/>
@@ -2208,7 +2208,7 @@
     </w:p>
     <w:p>
       <w:pPr>
-        <w:pStyle w:val="Liste3"/>
+        <w:pStyle w:val="List3"/>
         <w:rPr>
           <w:lang w:val="en-US"/>
         </w:rPr>
@@ -2217,12 +2217,26 @@
         <w:rPr>
           <w:lang w:val="en-US"/>
         </w:rPr>
-        <w:t>The HMI displays a message that indicates that the machine is ready to be started.</w:t>
+        <w:t xml:space="preserve">The HMI displays a message that indicates that the machine is ready </w:t>
+      </w:r>
+      <w:proofErr w:type="spellStart"/>
+      <w:r>
+        <w:rPr>
+          <w:lang w:val="en-US"/>
+        </w:rPr>
+        <w:t>tpo</w:t>
+      </w:r>
+      <w:proofErr w:type="spellEnd"/>
+      <w:r>
+        <w:rPr>
+          <w:lang w:val="en-US"/>
+        </w:rPr>
+        <w:t xml:space="preserve"> be started.</w:t>
       </w:r>
     </w:p>
     <w:p>
       <w:pPr>
-        <w:pStyle w:val="Liste3"/>
+        <w:pStyle w:val="List3"/>
         <w:rPr>
           <w:lang w:val="en-US"/>
         </w:rPr>
@@ -2268,7 +2282,7 @@
     </w:p>
     <w:p>
       <w:pPr>
-        <w:pStyle w:val="berschrift3"/>
+        <w:pStyle w:val="Heading3"/>
         <w:numPr>
           <w:ilvl w:val="2"/>
           <w:numId w:val="3"/>
@@ -2352,7 +2366,7 @@
     </w:p>
     <w:p>
       <w:pPr>
-        <w:pStyle w:val="berschrift1"/>
+        <w:pStyle w:val="Heading1"/>
         <w:rPr>
           <w:lang w:val="en-US"/>
         </w:rPr>
@@ -2383,7 +2397,6 @@
           <w:lang w:val="de-DE"/>
         </w:rPr>
       </w:pPr>
-      <w:proofErr w:type="spellStart"/>
       <w:r>
         <w:rPr>
           <w:vanish/>
@@ -2393,7 +2406,6 @@
         </w:rPr>
         <w:t>InsertTests</w:t>
       </w:r>
-      <w:proofErr w:type="spellEnd"/>
     </w:p>
     <w:p>
       <w:pPr>
@@ -2418,7 +2430,7 @@
     </w:p>
     <w:p>
       <w:pPr>
-        <w:pStyle w:val="berschrift1"/>
+        <w:pStyle w:val="Heading1"/>
         <w:tabs>
           <w:tab w:val="num" w:pos="567"/>
         </w:tabs>
@@ -2456,7 +2468,7 @@
     </w:p>
     <w:p>
       <w:pPr>
-        <w:pStyle w:val="berschrift2"/>
+        <w:pStyle w:val="Heading2"/>
       </w:pPr>
       <w:bookmarkStart w:id="50" w:name="_Toc40669005"/>
       <w:bookmarkStart w:id="51" w:name="_Toc75314922"/>
@@ -2783,7 +2795,7 @@
     </w:tbl>
     <w:p>
       <w:pPr>
-        <w:pStyle w:val="berschrift2"/>
+        <w:pStyle w:val="Heading2"/>
       </w:pPr>
       <w:bookmarkStart w:id="60" w:name="_Toc186711072"/>
       <w:r>
@@ -2830,7 +2842,6 @@
         <w:tc>
           <w:tcPr>
             <w:tcW w:w="2894" w:type="dxa"/>
-            <w:shd w:val="clear" w:color="auto" w:fill="auto"/>
           </w:tcPr>
           <w:p>
             <w:pPr>
@@ -2850,7 +2861,6 @@
         <w:tc>
           <w:tcPr>
             <w:tcW w:w="2803" w:type="dxa"/>
-            <w:shd w:val="clear" w:color="auto" w:fill="auto"/>
           </w:tcPr>
           <w:p>
             <w:pPr>
@@ -2883,7 +2893,6 @@
         <w:tc>
           <w:tcPr>
             <w:tcW w:w="3483" w:type="dxa"/>
-            <w:shd w:val="clear" w:color="auto" w:fill="auto"/>
           </w:tcPr>
           <w:p>
             <w:pPr>
@@ -2921,7 +2930,6 @@
         <w:tc>
           <w:tcPr>
             <w:tcW w:w="2894" w:type="dxa"/>
-            <w:shd w:val="clear" w:color="auto" w:fill="auto"/>
           </w:tcPr>
           <w:p>
             <w:pPr>
@@ -2950,7 +2958,6 @@
             <w:tcBorders>
               <w:right w:val="nil"/>
             </w:tcBorders>
-            <w:shd w:val="clear" w:color="auto" w:fill="auto"/>
           </w:tcPr>
           <w:p>
             <w:pPr>
@@ -2973,7 +2980,6 @@
             <w:tcBorders>
               <w:left w:val="nil"/>
             </w:tcBorders>
-            <w:shd w:val="clear" w:color="auto" w:fill="auto"/>
           </w:tcPr>
           <w:p>
             <w:pPr>
@@ -2998,7 +3004,6 @@
         <w:tc>
           <w:tcPr>
             <w:tcW w:w="2894" w:type="dxa"/>
-            <w:shd w:val="clear" w:color="auto" w:fill="auto"/>
           </w:tcPr>
           <w:p>
             <w:pPr>
@@ -3027,7 +3032,6 @@
             <w:tcBorders>
               <w:right w:val="nil"/>
             </w:tcBorders>
-            <w:shd w:val="clear" w:color="auto" w:fill="auto"/>
           </w:tcPr>
           <w:p>
             <w:pPr>
@@ -3050,7 +3054,6 @@
             <w:tcBorders>
               <w:left w:val="nil"/>
             </w:tcBorders>
-            <w:shd w:val="clear" w:color="auto" w:fill="auto"/>
           </w:tcPr>
           <w:p>
             <w:pPr>
@@ -3097,7 +3100,7 @@
 </file>
 
 <file path=word/endnotes.xml><?xml version="1.0" encoding="utf-8"?>
-<w:endnotes xmlns:wpc="http://schemas.microsoft.com/office/word/2010/wordprocessingCanvas" xmlns:cx="http://schemas.microsoft.com/office/drawing/2014/chartex" xmlns:cx1="http://schemas.microsoft.com/office/drawing/2015/9/8/chartex" xmlns:cx2="http://schemas.microsoft.com/office/drawing/2015/10/21/chartex" xmlns:cx3="http://schemas.microsoft.com/office/drawing/2016/5/9/chartex" xmlns:cx4="http://schemas.microsoft.com/office/drawing/2016/5/10/chartex" xmlns:cx5="http://schemas.microsoft.com/office/drawing/2016/5/11/chartex" xmlns:cx6="http://schemas.microsoft.com/office/drawing/2016/5/12/chartex" xmlns:cx7="http://schemas.microsoft.com/office/drawing/2016/5/13/chartex" xmlns:cx8="http://schemas.microsoft.com/office/drawing/2016/5/14/chartex" xmlns:mc="http://schemas.openxmlformats.org/markup-compatibility/2006" xmlns:aink="http://schemas.microsoft.com/office/drawing/2016/ink" xmlns:am3d="http://schemas.microsoft.com/office/drawing/2017/model3d" xmlns:o="urn:schemas-microsoft-com:office:office" xmlns:oel="http://schemas.microsoft.com/office/2019/extlst" xmlns:r="http://schemas.openxmlformats.org/officeDocument/2006/relationships" xmlns:m="http://schemas.openxmlformats.org/officeDocument/2006/math" xmlns:v="urn:schemas-microsoft-com:vml" xmlns:wp14="http://schemas.microsoft.com/office/word/2010/wordprocessingDrawing" xmlns:wp="http://schemas.openxmlformats.org/drawingml/2006/wordprocessingDrawing" xmlns:w10="urn:schemas-microsoft-com:office:word" xmlns:w="http://schemas.openxmlformats.org/wordprocessingml/2006/main" xmlns:w14="http://schemas.microsoft.com/office/word/2010/wordml" xmlns:w15="http://schemas.microsoft.com/office/word/2012/wordml" xmlns:w16cex="http://schemas.microsoft.com/office/word/2018/wordml/cex" xmlns:w16cid="http://schemas.microsoft.com/office/word/2016/wordml/cid" xmlns:w16="http://schemas.microsoft.com/office/word/2018/wordml" xmlns:w16sdtdh="http://schemas.microsoft.com/office/word/2020/wordml/sdtdatahash" xmlns:w16se="http://schemas.microsoft.com/office/word/2015/wordml/symex" xmlns:wpg="http://schemas.microsoft.com/office/word/2010/wordprocessingGroup" xmlns:wpi="http://schemas.microsoft.com/office/word/2010/wordprocessingInk" xmlns:wne="http://schemas.microsoft.com/office/word/2006/wordml" xmlns:wps="http://schemas.microsoft.com/office/word/2010/wordprocessingShape" mc:Ignorable="w14 w15 w16se w16cid w16 w16cex w16sdtdh wp14">
+<w:endnotes xmlns:wpc="http://schemas.microsoft.com/office/word/2010/wordprocessingCanvas" xmlns:cx="http://schemas.microsoft.com/office/drawing/2014/chartex" xmlns:cx1="http://schemas.microsoft.com/office/drawing/2015/9/8/chartex" xmlns:cx2="http://schemas.microsoft.com/office/drawing/2015/10/21/chartex" xmlns:cx3="http://schemas.microsoft.com/office/drawing/2016/5/9/chartex" xmlns:cx4="http://schemas.microsoft.com/office/drawing/2016/5/10/chartex" xmlns:cx5="http://schemas.microsoft.com/office/drawing/2016/5/11/chartex" xmlns:cx6="http://schemas.microsoft.com/office/drawing/2016/5/12/chartex" xmlns:cx7="http://schemas.microsoft.com/office/drawing/2016/5/13/chartex" xmlns:cx8="http://schemas.microsoft.com/office/drawing/2016/5/14/chartex" xmlns:mc="http://schemas.openxmlformats.org/markup-compatibility/2006" xmlns:aink="http://schemas.microsoft.com/office/drawing/2016/ink" xmlns:am3d="http://schemas.microsoft.com/office/drawing/2017/model3d" xmlns:o="urn:schemas-microsoft-com:office:office" xmlns:oel="http://schemas.microsoft.com/office/2019/extlst" xmlns:r="http://schemas.openxmlformats.org/officeDocument/2006/relationships" xmlns:m="http://schemas.openxmlformats.org/officeDocument/2006/math" xmlns:v="urn:schemas-microsoft-com:vml" xmlns:wp14="http://schemas.microsoft.com/office/word/2010/wordprocessingDrawing" xmlns:wp="http://schemas.openxmlformats.org/drawingml/2006/wordprocessingDrawing" xmlns:w10="urn:schemas-microsoft-com:office:word" xmlns:w="http://schemas.openxmlformats.org/wordprocessingml/2006/main" xmlns:w14="http://schemas.microsoft.com/office/word/2010/wordml" xmlns:w15="http://schemas.microsoft.com/office/word/2012/wordml" xmlns:w16cex="http://schemas.microsoft.com/office/word/2018/wordml/cex" xmlns:w16cid="http://schemas.microsoft.com/office/word/2016/wordml/cid" xmlns:w16="http://schemas.microsoft.com/office/word/2018/wordml" xmlns:w16du="http://schemas.microsoft.com/office/word/2023/wordml/word16du" xmlns:w16sdtdh="http://schemas.microsoft.com/office/word/2020/wordml/sdtdatahash" xmlns:w16sdtfl="http://schemas.microsoft.com/office/word/2024/wordml/sdtformatlock" xmlns:w16se="http://schemas.microsoft.com/office/word/2015/wordml/symex" xmlns:wpg="http://schemas.microsoft.com/office/word/2010/wordprocessingGroup" xmlns:wpi="http://schemas.microsoft.com/office/word/2010/wordprocessingInk" xmlns:wne="http://schemas.microsoft.com/office/word/2006/wordml" xmlns:wps="http://schemas.microsoft.com/office/word/2010/wordprocessingShape" mc:Ignorable="w14 w15 w16se w16cid w16 w16cex w16sdtdh w16sdtfl w16du wp14">
   <w:endnote w:type="separator" w:id="-1">
     <w:p>
       <w:r>
@@ -3116,17 +3119,17 @@
 </file>
 
 <file path=word/footer1.xml><?xml version="1.0" encoding="utf-8"?>
-<w:ftr xmlns:wpc="http://schemas.microsoft.com/office/word/2010/wordprocessingCanvas" xmlns:cx="http://schemas.microsoft.com/office/drawing/2014/chartex" xmlns:cx1="http://schemas.microsoft.com/office/drawing/2015/9/8/chartex" xmlns:cx2="http://schemas.microsoft.com/office/drawing/2015/10/21/chartex" xmlns:cx3="http://schemas.microsoft.com/office/drawing/2016/5/9/chartex" xmlns:cx4="http://schemas.microsoft.com/office/drawing/2016/5/10/chartex" xmlns:cx5="http://schemas.microsoft.com/office/drawing/2016/5/11/chartex" xmlns:cx6="http://schemas.microsoft.com/office/drawing/2016/5/12/chartex" xmlns:cx7="http://schemas.microsoft.com/office/drawing/2016/5/13/chartex" xmlns:cx8="http://schemas.microsoft.com/office/drawing/2016/5/14/chartex" xmlns:mc="http://schemas.openxmlformats.org/markup-compatibility/2006" xmlns:aink="http://schemas.microsoft.com/office/drawing/2016/ink" xmlns:am3d="http://schemas.microsoft.com/office/drawing/2017/model3d" xmlns:o="urn:schemas-microsoft-com:office:office" xmlns:oel="http://schemas.microsoft.com/office/2019/extlst" xmlns:r="http://schemas.openxmlformats.org/officeDocument/2006/relationships" xmlns:m="http://schemas.openxmlformats.org/officeDocument/2006/math" xmlns:v="urn:schemas-microsoft-com:vml" xmlns:wp14="http://schemas.microsoft.com/office/word/2010/wordprocessingDrawing" xmlns:wp="http://schemas.openxmlformats.org/drawingml/2006/wordprocessingDrawing" xmlns:w10="urn:schemas-microsoft-com:office:word" xmlns:w="http://schemas.openxmlformats.org/wordprocessingml/2006/main" xmlns:w14="http://schemas.microsoft.com/office/word/2010/wordml" xmlns:w15="http://schemas.microsoft.com/office/word/2012/wordml" xmlns:w16cex="http://schemas.microsoft.com/office/word/2018/wordml/cex" xmlns:w16cid="http://schemas.microsoft.com/office/word/2016/wordml/cid" xmlns:w16="http://schemas.microsoft.com/office/word/2018/wordml" xmlns:w16sdtdh="http://schemas.microsoft.com/office/word/2020/wordml/sdtdatahash" xmlns:w16se="http://schemas.microsoft.com/office/word/2015/wordml/symex" xmlns:wpg="http://schemas.microsoft.com/office/word/2010/wordprocessingGroup" xmlns:wpi="http://schemas.microsoft.com/office/word/2010/wordprocessingInk" xmlns:wne="http://schemas.microsoft.com/office/word/2006/wordml" xmlns:wps="http://schemas.microsoft.com/office/word/2010/wordprocessingShape" mc:Ignorable="w14 w15 w16se w16cid w16 w16cex w16sdtdh wp14">
+<w:ftr xmlns:wpc="http://schemas.microsoft.com/office/word/2010/wordprocessingCanvas" xmlns:cx="http://schemas.microsoft.com/office/drawing/2014/chartex" xmlns:cx1="http://schemas.microsoft.com/office/drawing/2015/9/8/chartex" xmlns:cx2="http://schemas.microsoft.com/office/drawing/2015/10/21/chartex" xmlns:cx3="http://schemas.microsoft.com/office/drawing/2016/5/9/chartex" xmlns:cx4="http://schemas.microsoft.com/office/drawing/2016/5/10/chartex" xmlns:cx5="http://schemas.microsoft.com/office/drawing/2016/5/11/chartex" xmlns:cx6="http://schemas.microsoft.com/office/drawing/2016/5/12/chartex" xmlns:cx7="http://schemas.microsoft.com/office/drawing/2016/5/13/chartex" xmlns:cx8="http://schemas.microsoft.com/office/drawing/2016/5/14/chartex" xmlns:mc="http://schemas.openxmlformats.org/markup-compatibility/2006" xmlns:aink="http://schemas.microsoft.com/office/drawing/2016/ink" xmlns:am3d="http://schemas.microsoft.com/office/drawing/2017/model3d" xmlns:o="urn:schemas-microsoft-com:office:office" xmlns:oel="http://schemas.microsoft.com/office/2019/extlst" xmlns:r="http://schemas.openxmlformats.org/officeDocument/2006/relationships" xmlns:m="http://schemas.openxmlformats.org/officeDocument/2006/math" xmlns:v="urn:schemas-microsoft-com:vml" xmlns:wp14="http://schemas.microsoft.com/office/word/2010/wordprocessingDrawing" xmlns:wp="http://schemas.openxmlformats.org/drawingml/2006/wordprocessingDrawing" xmlns:w10="urn:schemas-microsoft-com:office:word" xmlns:w="http://schemas.openxmlformats.org/wordprocessingml/2006/main" xmlns:w14="http://schemas.microsoft.com/office/word/2010/wordml" xmlns:w15="http://schemas.microsoft.com/office/word/2012/wordml" xmlns:w16cex="http://schemas.microsoft.com/office/word/2018/wordml/cex" xmlns:w16cid="http://schemas.microsoft.com/office/word/2016/wordml/cid" xmlns:w16="http://schemas.microsoft.com/office/word/2018/wordml" xmlns:w16du="http://schemas.microsoft.com/office/word/2023/wordml/word16du" xmlns:w16sdtdh="http://schemas.microsoft.com/office/word/2020/wordml/sdtdatahash" xmlns:w16sdtfl="http://schemas.microsoft.com/office/word/2024/wordml/sdtformatlock" xmlns:w16se="http://schemas.microsoft.com/office/word/2015/wordml/symex" xmlns:wpg="http://schemas.microsoft.com/office/word/2010/wordprocessingGroup" xmlns:wpi="http://schemas.microsoft.com/office/word/2010/wordprocessingInk" xmlns:wne="http://schemas.microsoft.com/office/word/2006/wordml" xmlns:wps="http://schemas.microsoft.com/office/word/2010/wordprocessingShape" mc:Ignorable="w14 w15 w16se w16cid w16 w16cex w16sdtdh w16sdtfl w16du wp14">
   <w:p>
     <w:pPr>
-      <w:pStyle w:val="Fuzeile"/>
+      <w:pStyle w:val="Footer"/>
     </w:pPr>
   </w:p>
 </w:ftr>
 </file>
 
 <file path=word/footer2.xml><?xml version="1.0" encoding="utf-8"?>
-<w:ftr xmlns:wpc="http://schemas.microsoft.com/office/word/2010/wordprocessingCanvas" xmlns:cx="http://schemas.microsoft.com/office/drawing/2014/chartex" xmlns:cx1="http://schemas.microsoft.com/office/drawing/2015/9/8/chartex" xmlns:cx2="http://schemas.microsoft.com/office/drawing/2015/10/21/chartex" xmlns:cx3="http://schemas.microsoft.com/office/drawing/2016/5/9/chartex" xmlns:cx4="http://schemas.microsoft.com/office/drawing/2016/5/10/chartex" xmlns:cx5="http://schemas.microsoft.com/office/drawing/2016/5/11/chartex" xmlns:cx6="http://schemas.microsoft.com/office/drawing/2016/5/12/chartex" xmlns:cx7="http://schemas.microsoft.com/office/drawing/2016/5/13/chartex" xmlns:cx8="http://schemas.microsoft.com/office/drawing/2016/5/14/chartex" xmlns:mc="http://schemas.openxmlformats.org/markup-compatibility/2006" xmlns:aink="http://schemas.microsoft.com/office/drawing/2016/ink" xmlns:am3d="http://schemas.microsoft.com/office/drawing/2017/model3d" xmlns:o="urn:schemas-microsoft-com:office:office" xmlns:oel="http://schemas.microsoft.com/office/2019/extlst" xmlns:r="http://schemas.openxmlformats.org/officeDocument/2006/relationships" xmlns:m="http://schemas.openxmlformats.org/officeDocument/2006/math" xmlns:v="urn:schemas-microsoft-com:vml" xmlns:wp14="http://schemas.microsoft.com/office/word/2010/wordprocessingDrawing" xmlns:wp="http://schemas.openxmlformats.org/drawingml/2006/wordprocessingDrawing" xmlns:w10="urn:schemas-microsoft-com:office:word" xmlns:w="http://schemas.openxmlformats.org/wordprocessingml/2006/main" xmlns:w14="http://schemas.microsoft.com/office/word/2010/wordml" xmlns:w15="http://schemas.microsoft.com/office/word/2012/wordml" xmlns:w16cex="http://schemas.microsoft.com/office/word/2018/wordml/cex" xmlns:w16cid="http://schemas.microsoft.com/office/word/2016/wordml/cid" xmlns:w16="http://schemas.microsoft.com/office/word/2018/wordml" xmlns:w16sdtdh="http://schemas.microsoft.com/office/word/2020/wordml/sdtdatahash" xmlns:w16se="http://schemas.microsoft.com/office/word/2015/wordml/symex" xmlns:wpg="http://schemas.microsoft.com/office/word/2010/wordprocessingGroup" xmlns:wpi="http://schemas.microsoft.com/office/word/2010/wordprocessingInk" xmlns:wne="http://schemas.microsoft.com/office/word/2006/wordml" xmlns:wps="http://schemas.microsoft.com/office/word/2010/wordprocessingShape" mc:Ignorable="w14 w15 w16se w16cid w16 w16cex w16sdtdh wp14">
+<w:ftr xmlns:wpc="http://schemas.microsoft.com/office/word/2010/wordprocessingCanvas" xmlns:cx="http://schemas.microsoft.com/office/drawing/2014/chartex" xmlns:cx1="http://schemas.microsoft.com/office/drawing/2015/9/8/chartex" xmlns:cx2="http://schemas.microsoft.com/office/drawing/2015/10/21/chartex" xmlns:cx3="http://schemas.microsoft.com/office/drawing/2016/5/9/chartex" xmlns:cx4="http://schemas.microsoft.com/office/drawing/2016/5/10/chartex" xmlns:cx5="http://schemas.microsoft.com/office/drawing/2016/5/11/chartex" xmlns:cx6="http://schemas.microsoft.com/office/drawing/2016/5/12/chartex" xmlns:cx7="http://schemas.microsoft.com/office/drawing/2016/5/13/chartex" xmlns:cx8="http://schemas.microsoft.com/office/drawing/2016/5/14/chartex" xmlns:mc="http://schemas.openxmlformats.org/markup-compatibility/2006" xmlns:aink="http://schemas.microsoft.com/office/drawing/2016/ink" xmlns:am3d="http://schemas.microsoft.com/office/drawing/2017/model3d" xmlns:o="urn:schemas-microsoft-com:office:office" xmlns:oel="http://schemas.microsoft.com/office/2019/extlst" xmlns:r="http://schemas.openxmlformats.org/officeDocument/2006/relationships" xmlns:m="http://schemas.openxmlformats.org/officeDocument/2006/math" xmlns:v="urn:schemas-microsoft-com:vml" xmlns:wp14="http://schemas.microsoft.com/office/word/2010/wordprocessingDrawing" xmlns:wp="http://schemas.openxmlformats.org/drawingml/2006/wordprocessingDrawing" xmlns:w10="urn:schemas-microsoft-com:office:word" xmlns:w="http://schemas.openxmlformats.org/wordprocessingml/2006/main" xmlns:w14="http://schemas.microsoft.com/office/word/2010/wordml" xmlns:w15="http://schemas.microsoft.com/office/word/2012/wordml" xmlns:w16cex="http://schemas.microsoft.com/office/word/2018/wordml/cex" xmlns:w16cid="http://schemas.microsoft.com/office/word/2016/wordml/cid" xmlns:w16="http://schemas.microsoft.com/office/word/2018/wordml" xmlns:w16du="http://schemas.microsoft.com/office/word/2023/wordml/word16du" xmlns:w16sdtdh="http://schemas.microsoft.com/office/word/2020/wordml/sdtdatahash" xmlns:w16sdtfl="http://schemas.microsoft.com/office/word/2024/wordml/sdtformatlock" xmlns:w16se="http://schemas.microsoft.com/office/word/2015/wordml/symex" xmlns:wpg="http://schemas.microsoft.com/office/word/2010/wordprocessingGroup" xmlns:wpi="http://schemas.microsoft.com/office/word/2010/wordprocessingInk" xmlns:wne="http://schemas.microsoft.com/office/word/2006/wordml" xmlns:wps="http://schemas.microsoft.com/office/word/2010/wordprocessingShape" mc:Ignorable="w14 w15 w16se w16cid w16 w16cex w16sdtdh w16sdtfl w16du wp14">
   <w:tbl>
     <w:tblPr>
       <w:tblW w:w="9250" w:type="dxa"/>
@@ -3153,7 +3156,7 @@
         </w:tcPr>
         <w:p>
           <w:pPr>
-            <w:pStyle w:val="Fuzeile"/>
+            <w:pStyle w:val="Footer"/>
             <w:rPr>
               <w:sz w:val="16"/>
               <w:szCs w:val="16"/>
@@ -3247,25 +3250,15 @@
               <w:szCs w:val="16"/>
               <w:lang w:val="de-DE"/>
             </w:rPr>
-            <w:t xml:space="preserve">© Copyright </w:t>
+            <w:t xml:space="preserve">© </w:t>
           </w:r>
-          <w:proofErr w:type="spellStart"/>
           <w:r>
             <w:rPr>
               <w:sz w:val="16"/>
               <w:szCs w:val="16"/>
               <w:lang w:val="de-DE"/>
             </w:rPr>
-            <w:t>by</w:t>
-          </w:r>
-          <w:proofErr w:type="spellEnd"/>
-          <w:r>
-            <w:rPr>
-              <w:sz w:val="16"/>
-              <w:szCs w:val="16"/>
-              <w:lang w:val="de-DE"/>
-            </w:rPr>
-            <w:t xml:space="preserve"> IWK Verpackungstechnik GmbH</w:t>
+            <w:t>Copyright by IWK Verpackungstechnik GmbH</w:t>
           </w:r>
           <w:r>
             <w:rPr>
@@ -3283,54 +3276,13 @@
             </w:rPr>
             <w:t xml:space="preserve"> </w:t>
           </w:r>
-          <w:r>
-            <w:rPr>
-              <w:sz w:val="16"/>
-              <w:szCs w:val="16"/>
-              <w:lang w:val="en-GB"/>
-            </w:rPr>
-            <w:fldChar w:fldCharType="begin"/>
-          </w:r>
-          <w:r>
-            <w:rPr>
-              <w:sz w:val="16"/>
-              <w:szCs w:val="16"/>
-              <w:lang w:val="en-GB"/>
-            </w:rPr>
-            <w:instrText xml:space="preserve"> PRINTDATE  \@ "YYYY"  \* MERGEFORMAT </w:instrText>
-          </w:r>
-          <w:r>
-            <w:rPr>
-              <w:sz w:val="16"/>
-              <w:szCs w:val="16"/>
-              <w:lang w:val="en-GB"/>
-            </w:rPr>
-            <w:fldChar w:fldCharType="separate"/>
-          </w:r>
-          <w:r>
-            <w:rPr>
-              <w:noProof/>
-              <w:sz w:val="16"/>
-              <w:szCs w:val="16"/>
-              <w:lang w:val="en-GB"/>
-            </w:rPr>
-            <w:t>2009</w:t>
-          </w:r>
-          <w:r>
-            <w:rPr>
-              <w:sz w:val="16"/>
-              <w:szCs w:val="16"/>
-              <w:lang w:val="en-GB"/>
-            </w:rPr>
-            <w:fldChar w:fldCharType="end"/>
-          </w:r>
         </w:p>
       </w:tc>
     </w:tr>
   </w:tbl>
   <w:p>
     <w:pPr>
-      <w:pStyle w:val="Fuzeile"/>
+      <w:pStyle w:val="Footer"/>
       <w:rPr>
         <w:lang w:val="de-DE"/>
       </w:rPr>
@@ -3340,17 +3292,17 @@
 </file>
 
 <file path=word/footer3.xml><?xml version="1.0" encoding="utf-8"?>
-<w:ftr xmlns:wpc="http://schemas.microsoft.com/office/word/2010/wordprocessingCanvas" xmlns:cx="http://schemas.microsoft.com/office/drawing/2014/chartex" xmlns:cx1="http://schemas.microsoft.com/office/drawing/2015/9/8/chartex" xmlns:cx2="http://schemas.microsoft.com/office/drawing/2015/10/21/chartex" xmlns:cx3="http://schemas.microsoft.com/office/drawing/2016/5/9/chartex" xmlns:cx4="http://schemas.microsoft.com/office/drawing/2016/5/10/chartex" xmlns:cx5="http://schemas.microsoft.com/office/drawing/2016/5/11/chartex" xmlns:cx6="http://schemas.microsoft.com/office/drawing/2016/5/12/chartex" xmlns:cx7="http://schemas.microsoft.com/office/drawing/2016/5/13/chartex" xmlns:cx8="http://schemas.microsoft.com/office/drawing/2016/5/14/chartex" xmlns:mc="http://schemas.openxmlformats.org/markup-compatibility/2006" xmlns:aink="http://schemas.microsoft.com/office/drawing/2016/ink" xmlns:am3d="http://schemas.microsoft.com/office/drawing/2017/model3d" xmlns:o="urn:schemas-microsoft-com:office:office" xmlns:oel="http://schemas.microsoft.com/office/2019/extlst" xmlns:r="http://schemas.openxmlformats.org/officeDocument/2006/relationships" xmlns:m="http://schemas.openxmlformats.org/officeDocument/2006/math" xmlns:v="urn:schemas-microsoft-com:vml" xmlns:wp14="http://schemas.microsoft.com/office/word/2010/wordprocessingDrawing" xmlns:wp="http://schemas.openxmlformats.org/drawingml/2006/wordprocessingDrawing" xmlns:w10="urn:schemas-microsoft-com:office:word" xmlns:w="http://schemas.openxmlformats.org/wordprocessingml/2006/main" xmlns:w14="http://schemas.microsoft.com/office/word/2010/wordml" xmlns:w15="http://schemas.microsoft.com/office/word/2012/wordml" xmlns:w16cex="http://schemas.microsoft.com/office/word/2018/wordml/cex" xmlns:w16cid="http://schemas.microsoft.com/office/word/2016/wordml/cid" xmlns:w16="http://schemas.microsoft.com/office/word/2018/wordml" xmlns:w16sdtdh="http://schemas.microsoft.com/office/word/2020/wordml/sdtdatahash" xmlns:w16se="http://schemas.microsoft.com/office/word/2015/wordml/symex" xmlns:wpg="http://schemas.microsoft.com/office/word/2010/wordprocessingGroup" xmlns:wpi="http://schemas.microsoft.com/office/word/2010/wordprocessingInk" xmlns:wne="http://schemas.microsoft.com/office/word/2006/wordml" xmlns:wps="http://schemas.microsoft.com/office/word/2010/wordprocessingShape" mc:Ignorable="w14 w15 w16se w16cid w16 w16cex w16sdtdh wp14">
+<w:ftr xmlns:wpc="http://schemas.microsoft.com/office/word/2010/wordprocessingCanvas" xmlns:cx="http://schemas.microsoft.com/office/drawing/2014/chartex" xmlns:cx1="http://schemas.microsoft.com/office/drawing/2015/9/8/chartex" xmlns:cx2="http://schemas.microsoft.com/office/drawing/2015/10/21/chartex" xmlns:cx3="http://schemas.microsoft.com/office/drawing/2016/5/9/chartex" xmlns:cx4="http://schemas.microsoft.com/office/drawing/2016/5/10/chartex" xmlns:cx5="http://schemas.microsoft.com/office/drawing/2016/5/11/chartex" xmlns:cx6="http://schemas.microsoft.com/office/drawing/2016/5/12/chartex" xmlns:cx7="http://schemas.microsoft.com/office/drawing/2016/5/13/chartex" xmlns:cx8="http://schemas.microsoft.com/office/drawing/2016/5/14/chartex" xmlns:mc="http://schemas.openxmlformats.org/markup-compatibility/2006" xmlns:aink="http://schemas.microsoft.com/office/drawing/2016/ink" xmlns:am3d="http://schemas.microsoft.com/office/drawing/2017/model3d" xmlns:o="urn:schemas-microsoft-com:office:office" xmlns:oel="http://schemas.microsoft.com/office/2019/extlst" xmlns:r="http://schemas.openxmlformats.org/officeDocument/2006/relationships" xmlns:m="http://schemas.openxmlformats.org/officeDocument/2006/math" xmlns:v="urn:schemas-microsoft-com:vml" xmlns:wp14="http://schemas.microsoft.com/office/word/2010/wordprocessingDrawing" xmlns:wp="http://schemas.openxmlformats.org/drawingml/2006/wordprocessingDrawing" xmlns:w10="urn:schemas-microsoft-com:office:word" xmlns:w="http://schemas.openxmlformats.org/wordprocessingml/2006/main" xmlns:w14="http://schemas.microsoft.com/office/word/2010/wordml" xmlns:w15="http://schemas.microsoft.com/office/word/2012/wordml" xmlns:w16cex="http://schemas.microsoft.com/office/word/2018/wordml/cex" xmlns:w16cid="http://schemas.microsoft.com/office/word/2016/wordml/cid" xmlns:w16="http://schemas.microsoft.com/office/word/2018/wordml" xmlns:w16du="http://schemas.microsoft.com/office/word/2023/wordml/word16du" xmlns:w16sdtdh="http://schemas.microsoft.com/office/word/2020/wordml/sdtdatahash" xmlns:w16sdtfl="http://schemas.microsoft.com/office/word/2024/wordml/sdtformatlock" xmlns:w16se="http://schemas.microsoft.com/office/word/2015/wordml/symex" xmlns:wpg="http://schemas.microsoft.com/office/word/2010/wordprocessingGroup" xmlns:wpi="http://schemas.microsoft.com/office/word/2010/wordprocessingInk" xmlns:wne="http://schemas.microsoft.com/office/word/2006/wordml" xmlns:wps="http://schemas.microsoft.com/office/word/2010/wordprocessingShape" mc:Ignorable="w14 w15 w16se w16cid w16 w16cex w16sdtdh w16sdtfl w16du wp14">
   <w:p>
     <w:pPr>
-      <w:pStyle w:val="Fuzeile"/>
+      <w:pStyle w:val="Footer"/>
     </w:pPr>
   </w:p>
 </w:ftr>
 </file>
 
 <file path=word/footer4.xml><?xml version="1.0" encoding="utf-8"?>
-<w:ftr xmlns:wpc="http://schemas.microsoft.com/office/word/2010/wordprocessingCanvas" xmlns:cx="http://schemas.microsoft.com/office/drawing/2014/chartex" xmlns:cx1="http://schemas.microsoft.com/office/drawing/2015/9/8/chartex" xmlns:cx2="http://schemas.microsoft.com/office/drawing/2015/10/21/chartex" xmlns:cx3="http://schemas.microsoft.com/office/drawing/2016/5/9/chartex" xmlns:cx4="http://schemas.microsoft.com/office/drawing/2016/5/10/chartex" xmlns:cx5="http://schemas.microsoft.com/office/drawing/2016/5/11/chartex" xmlns:cx6="http://schemas.microsoft.com/office/drawing/2016/5/12/chartex" xmlns:cx7="http://schemas.microsoft.com/office/drawing/2016/5/13/chartex" xmlns:cx8="http://schemas.microsoft.com/office/drawing/2016/5/14/chartex" xmlns:mc="http://schemas.openxmlformats.org/markup-compatibility/2006" xmlns:aink="http://schemas.microsoft.com/office/drawing/2016/ink" xmlns:am3d="http://schemas.microsoft.com/office/drawing/2017/model3d" xmlns:o="urn:schemas-microsoft-com:office:office" xmlns:oel="http://schemas.microsoft.com/office/2019/extlst" xmlns:r="http://schemas.openxmlformats.org/officeDocument/2006/relationships" xmlns:m="http://schemas.openxmlformats.org/officeDocument/2006/math" xmlns:v="urn:schemas-microsoft-com:vml" xmlns:wp14="http://schemas.microsoft.com/office/word/2010/wordprocessingDrawing" xmlns:wp="http://schemas.openxmlformats.org/drawingml/2006/wordprocessingDrawing" xmlns:w10="urn:schemas-microsoft-com:office:word" xmlns:w="http://schemas.openxmlformats.org/wordprocessingml/2006/main" xmlns:w14="http://schemas.microsoft.com/office/word/2010/wordml" xmlns:w15="http://schemas.microsoft.com/office/word/2012/wordml" xmlns:w16cex="http://schemas.microsoft.com/office/word/2018/wordml/cex" xmlns:w16cid="http://schemas.microsoft.com/office/word/2016/wordml/cid" xmlns:w16="http://schemas.microsoft.com/office/word/2018/wordml" xmlns:w16sdtdh="http://schemas.microsoft.com/office/word/2020/wordml/sdtdatahash" xmlns:w16se="http://schemas.microsoft.com/office/word/2015/wordml/symex" xmlns:wpg="http://schemas.microsoft.com/office/word/2010/wordprocessingGroup" xmlns:wpi="http://schemas.microsoft.com/office/word/2010/wordprocessingInk" xmlns:wne="http://schemas.microsoft.com/office/word/2006/wordml" xmlns:wps="http://schemas.microsoft.com/office/word/2010/wordprocessingShape" mc:Ignorable="w14 w15 w16se w16cid w16 w16cex w16sdtdh wp14">
+<w:ftr xmlns:wpc="http://schemas.microsoft.com/office/word/2010/wordprocessingCanvas" xmlns:cx="http://schemas.microsoft.com/office/drawing/2014/chartex" xmlns:cx1="http://schemas.microsoft.com/office/drawing/2015/9/8/chartex" xmlns:cx2="http://schemas.microsoft.com/office/drawing/2015/10/21/chartex" xmlns:cx3="http://schemas.microsoft.com/office/drawing/2016/5/9/chartex" xmlns:cx4="http://schemas.microsoft.com/office/drawing/2016/5/10/chartex" xmlns:cx5="http://schemas.microsoft.com/office/drawing/2016/5/11/chartex" xmlns:cx6="http://schemas.microsoft.com/office/drawing/2016/5/12/chartex" xmlns:cx7="http://schemas.microsoft.com/office/drawing/2016/5/13/chartex" xmlns:cx8="http://schemas.microsoft.com/office/drawing/2016/5/14/chartex" xmlns:mc="http://schemas.openxmlformats.org/markup-compatibility/2006" xmlns:aink="http://schemas.microsoft.com/office/drawing/2016/ink" xmlns:am3d="http://schemas.microsoft.com/office/drawing/2017/model3d" xmlns:o="urn:schemas-microsoft-com:office:office" xmlns:oel="http://schemas.microsoft.com/office/2019/extlst" xmlns:r="http://schemas.openxmlformats.org/officeDocument/2006/relationships" xmlns:m="http://schemas.openxmlformats.org/officeDocument/2006/math" xmlns:v="urn:schemas-microsoft-com:vml" xmlns:wp14="http://schemas.microsoft.com/office/word/2010/wordprocessingDrawing" xmlns:wp="http://schemas.openxmlformats.org/drawingml/2006/wordprocessingDrawing" xmlns:w10="urn:schemas-microsoft-com:office:word" xmlns:w="http://schemas.openxmlformats.org/wordprocessingml/2006/main" xmlns:w14="http://schemas.microsoft.com/office/word/2010/wordml" xmlns:w15="http://schemas.microsoft.com/office/word/2012/wordml" xmlns:w16cex="http://schemas.microsoft.com/office/word/2018/wordml/cex" xmlns:w16cid="http://schemas.microsoft.com/office/word/2016/wordml/cid" xmlns:w16="http://schemas.microsoft.com/office/word/2018/wordml" xmlns:w16du="http://schemas.microsoft.com/office/word/2023/wordml/word16du" xmlns:w16sdtdh="http://schemas.microsoft.com/office/word/2020/wordml/sdtdatahash" xmlns:w16sdtfl="http://schemas.microsoft.com/office/word/2024/wordml/sdtformatlock" xmlns:w16se="http://schemas.microsoft.com/office/word/2015/wordml/symex" xmlns:wpg="http://schemas.microsoft.com/office/word/2010/wordprocessingGroup" xmlns:wpi="http://schemas.microsoft.com/office/word/2010/wordprocessingInk" xmlns:wne="http://schemas.microsoft.com/office/word/2006/wordml" xmlns:wps="http://schemas.microsoft.com/office/word/2010/wordprocessingShape" mc:Ignorable="w14 w15 w16se w16cid w16 w16cex w16sdtdh w16sdtfl w16du wp14">
   <w:tbl>
     <w:tblPr>
       <w:tblW w:w="9250" w:type="dxa"/>
@@ -3377,7 +3329,7 @@
         </w:tcPr>
         <w:p>
           <w:pPr>
-            <w:pStyle w:val="Fuzeile"/>
+            <w:pStyle w:val="Footer"/>
             <w:rPr>
               <w:sz w:val="16"/>
               <w:szCs w:val="16"/>
@@ -3471,25 +3423,15 @@
               <w:szCs w:val="16"/>
               <w:lang w:val="de-DE"/>
             </w:rPr>
-            <w:t xml:space="preserve">© Copyright </w:t>
+            <w:t xml:space="preserve">© </w:t>
           </w:r>
-          <w:proofErr w:type="spellStart"/>
           <w:r>
             <w:rPr>
               <w:sz w:val="16"/>
               <w:szCs w:val="16"/>
               <w:lang w:val="de-DE"/>
             </w:rPr>
-            <w:t>by</w:t>
-          </w:r>
-          <w:proofErr w:type="spellEnd"/>
-          <w:r>
-            <w:rPr>
-              <w:sz w:val="16"/>
-              <w:szCs w:val="16"/>
-              <w:lang w:val="de-DE"/>
-            </w:rPr>
-            <w:t xml:space="preserve"> IWK Verpackungstechnik GmbH</w:t>
+            <w:t>Copyright by IWK Verpackungstechnik GmbH</w:t>
           </w:r>
           <w:r>
             <w:rPr>
@@ -3507,54 +3449,13 @@
             </w:rPr>
             <w:t xml:space="preserve"> </w:t>
           </w:r>
-          <w:r>
-            <w:rPr>
-              <w:sz w:val="16"/>
-              <w:szCs w:val="16"/>
-              <w:lang w:val="en-GB"/>
-            </w:rPr>
-            <w:fldChar w:fldCharType="begin"/>
-          </w:r>
-          <w:r>
-            <w:rPr>
-              <w:sz w:val="16"/>
-              <w:szCs w:val="16"/>
-              <w:lang w:val="en-GB"/>
-            </w:rPr>
-            <w:instrText xml:space="preserve"> PRINTDATE  \@ "YYYY"  \* MERGEFORMAT </w:instrText>
-          </w:r>
-          <w:r>
-            <w:rPr>
-              <w:sz w:val="16"/>
-              <w:szCs w:val="16"/>
-              <w:lang w:val="en-GB"/>
-            </w:rPr>
-            <w:fldChar w:fldCharType="separate"/>
-          </w:r>
-          <w:r>
-            <w:rPr>
-              <w:noProof/>
-              <w:sz w:val="16"/>
-              <w:szCs w:val="16"/>
-              <w:lang w:val="en-GB"/>
-            </w:rPr>
-            <w:t>2009</w:t>
-          </w:r>
-          <w:r>
-            <w:rPr>
-              <w:sz w:val="16"/>
-              <w:szCs w:val="16"/>
-              <w:lang w:val="en-GB"/>
-            </w:rPr>
-            <w:fldChar w:fldCharType="end"/>
-          </w:r>
         </w:p>
       </w:tc>
     </w:tr>
   </w:tbl>
   <w:p>
     <w:pPr>
-      <w:pStyle w:val="Fuzeile"/>
+      <w:pStyle w:val="Footer"/>
       <w:rPr>
         <w:lang w:val="de-DE"/>
       </w:rPr>
@@ -3564,7 +3465,7 @@
 </file>
 
 <file path=word/footer5.xml><?xml version="1.0" encoding="utf-8"?>
-<w:ftr xmlns:wpc="http://schemas.microsoft.com/office/word/2010/wordprocessingCanvas" xmlns:cx="http://schemas.microsoft.com/office/drawing/2014/chartex" xmlns:cx1="http://schemas.microsoft.com/office/drawing/2015/9/8/chartex" xmlns:cx2="http://schemas.microsoft.com/office/drawing/2015/10/21/chartex" xmlns:cx3="http://schemas.microsoft.com/office/drawing/2016/5/9/chartex" xmlns:cx4="http://schemas.microsoft.com/office/drawing/2016/5/10/chartex" xmlns:cx5="http://schemas.microsoft.com/office/drawing/2016/5/11/chartex" xmlns:cx6="http://schemas.microsoft.com/office/drawing/2016/5/12/chartex" xmlns:cx7="http://schemas.microsoft.com/office/drawing/2016/5/13/chartex" xmlns:cx8="http://schemas.microsoft.com/office/drawing/2016/5/14/chartex" xmlns:mc="http://schemas.openxmlformats.org/markup-compatibility/2006" xmlns:aink="http://schemas.microsoft.com/office/drawing/2016/ink" xmlns:am3d="http://schemas.microsoft.com/office/drawing/2017/model3d" xmlns:o="urn:schemas-microsoft-com:office:office" xmlns:oel="http://schemas.microsoft.com/office/2019/extlst" xmlns:r="http://schemas.openxmlformats.org/officeDocument/2006/relationships" xmlns:m="http://schemas.openxmlformats.org/officeDocument/2006/math" xmlns:v="urn:schemas-microsoft-com:vml" xmlns:wp14="http://schemas.microsoft.com/office/word/2010/wordprocessingDrawing" xmlns:wp="http://schemas.openxmlformats.org/drawingml/2006/wordprocessingDrawing" xmlns:w10="urn:schemas-microsoft-com:office:word" xmlns:w="http://schemas.openxmlformats.org/wordprocessingml/2006/main" xmlns:w14="http://schemas.microsoft.com/office/word/2010/wordml" xmlns:w15="http://schemas.microsoft.com/office/word/2012/wordml" xmlns:w16cex="http://schemas.microsoft.com/office/word/2018/wordml/cex" xmlns:w16cid="http://schemas.microsoft.com/office/word/2016/wordml/cid" xmlns:w16="http://schemas.microsoft.com/office/word/2018/wordml" xmlns:w16sdtdh="http://schemas.microsoft.com/office/word/2020/wordml/sdtdatahash" xmlns:w16se="http://schemas.microsoft.com/office/word/2015/wordml/symex" xmlns:wpg="http://schemas.microsoft.com/office/word/2010/wordprocessingGroup" xmlns:wpi="http://schemas.microsoft.com/office/word/2010/wordprocessingInk" xmlns:wne="http://schemas.microsoft.com/office/word/2006/wordml" xmlns:wps="http://schemas.microsoft.com/office/word/2010/wordprocessingShape" mc:Ignorable="w14 w15 w16se w16cid w16 w16cex w16sdtdh wp14">
+<w:ftr xmlns:wpc="http://schemas.microsoft.com/office/word/2010/wordprocessingCanvas" xmlns:cx="http://schemas.microsoft.com/office/drawing/2014/chartex" xmlns:cx1="http://schemas.microsoft.com/office/drawing/2015/9/8/chartex" xmlns:cx2="http://schemas.microsoft.com/office/drawing/2015/10/21/chartex" xmlns:cx3="http://schemas.microsoft.com/office/drawing/2016/5/9/chartex" xmlns:cx4="http://schemas.microsoft.com/office/drawing/2016/5/10/chartex" xmlns:cx5="http://schemas.microsoft.com/office/drawing/2016/5/11/chartex" xmlns:cx6="http://schemas.microsoft.com/office/drawing/2016/5/12/chartex" xmlns:cx7="http://schemas.microsoft.com/office/drawing/2016/5/13/chartex" xmlns:cx8="http://schemas.microsoft.com/office/drawing/2016/5/14/chartex" xmlns:mc="http://schemas.openxmlformats.org/markup-compatibility/2006" xmlns:aink="http://schemas.microsoft.com/office/drawing/2016/ink" xmlns:am3d="http://schemas.microsoft.com/office/drawing/2017/model3d" xmlns:o="urn:schemas-microsoft-com:office:office" xmlns:oel="http://schemas.microsoft.com/office/2019/extlst" xmlns:r="http://schemas.openxmlformats.org/officeDocument/2006/relationships" xmlns:m="http://schemas.openxmlformats.org/officeDocument/2006/math" xmlns:v="urn:schemas-microsoft-com:vml" xmlns:wp14="http://schemas.microsoft.com/office/word/2010/wordprocessingDrawing" xmlns:wp="http://schemas.openxmlformats.org/drawingml/2006/wordprocessingDrawing" xmlns:w10="urn:schemas-microsoft-com:office:word" xmlns:w="http://schemas.openxmlformats.org/wordprocessingml/2006/main" xmlns:w14="http://schemas.microsoft.com/office/word/2010/wordml" xmlns:w15="http://schemas.microsoft.com/office/word/2012/wordml" xmlns:w16cex="http://schemas.microsoft.com/office/word/2018/wordml/cex" xmlns:w16cid="http://schemas.microsoft.com/office/word/2016/wordml/cid" xmlns:w16="http://schemas.microsoft.com/office/word/2018/wordml" xmlns:w16du="http://schemas.microsoft.com/office/word/2023/wordml/word16du" xmlns:w16sdtdh="http://schemas.microsoft.com/office/word/2020/wordml/sdtdatahash" xmlns:w16sdtfl="http://schemas.microsoft.com/office/word/2024/wordml/sdtformatlock" xmlns:w16se="http://schemas.microsoft.com/office/word/2015/wordml/symex" xmlns:wpg="http://schemas.microsoft.com/office/word/2010/wordprocessingGroup" xmlns:wpi="http://schemas.microsoft.com/office/word/2010/wordprocessingInk" xmlns:wne="http://schemas.microsoft.com/office/word/2006/wordml" xmlns:wps="http://schemas.microsoft.com/office/word/2010/wordprocessingShape" mc:Ignorable="w14 w15 w16se w16cid w16 w16cex w16sdtdh w16sdtfl w16du wp14">
   <w:tbl>
     <w:tblPr>
       <w:tblW w:w="9250" w:type="dxa"/>
@@ -3591,7 +3492,7 @@
         </w:tcPr>
         <w:p>
           <w:pPr>
-            <w:pStyle w:val="Fuzeile"/>
+            <w:pStyle w:val="Footer"/>
             <w:rPr>
               <w:sz w:val="16"/>
               <w:szCs w:val="16"/>
@@ -3685,25 +3586,15 @@
               <w:szCs w:val="16"/>
               <w:lang w:val="de-DE"/>
             </w:rPr>
-            <w:t xml:space="preserve">© Copyright </w:t>
+            <w:t xml:space="preserve">© </w:t>
           </w:r>
-          <w:proofErr w:type="spellStart"/>
           <w:r>
             <w:rPr>
               <w:sz w:val="16"/>
               <w:szCs w:val="16"/>
               <w:lang w:val="de-DE"/>
             </w:rPr>
-            <w:t>by</w:t>
-          </w:r>
-          <w:proofErr w:type="spellEnd"/>
-          <w:r>
-            <w:rPr>
-              <w:sz w:val="16"/>
-              <w:szCs w:val="16"/>
-              <w:lang w:val="de-DE"/>
-            </w:rPr>
-            <w:t xml:space="preserve"> IWK Verpackungstechnik GmbH</w:t>
+            <w:t>Copyright by IWK Verpackungstechnik GmbH</w:t>
           </w:r>
           <w:r>
             <w:rPr>
@@ -3721,54 +3612,13 @@
             </w:rPr>
             <w:t xml:space="preserve"> </w:t>
           </w:r>
-          <w:r>
-            <w:rPr>
-              <w:sz w:val="16"/>
-              <w:szCs w:val="16"/>
-              <w:lang w:val="en-GB"/>
-            </w:rPr>
-            <w:fldChar w:fldCharType="begin"/>
-          </w:r>
-          <w:r>
-            <w:rPr>
-              <w:sz w:val="16"/>
-              <w:szCs w:val="16"/>
-              <w:lang w:val="en-GB"/>
-            </w:rPr>
-            <w:instrText xml:space="preserve"> PRINTDATE  \@ "YYYY"  \* MERGEFORMAT </w:instrText>
-          </w:r>
-          <w:r>
-            <w:rPr>
-              <w:sz w:val="16"/>
-              <w:szCs w:val="16"/>
-              <w:lang w:val="en-GB"/>
-            </w:rPr>
-            <w:fldChar w:fldCharType="separate"/>
-          </w:r>
-          <w:r>
-            <w:rPr>
-              <w:noProof/>
-              <w:sz w:val="16"/>
-              <w:szCs w:val="16"/>
-              <w:lang w:val="en-GB"/>
-            </w:rPr>
-            <w:t>2009</w:t>
-          </w:r>
-          <w:r>
-            <w:rPr>
-              <w:sz w:val="16"/>
-              <w:szCs w:val="16"/>
-              <w:lang w:val="en-GB"/>
-            </w:rPr>
-            <w:fldChar w:fldCharType="end"/>
-          </w:r>
         </w:p>
       </w:tc>
     </w:tr>
   </w:tbl>
   <w:p>
     <w:pPr>
-      <w:pStyle w:val="Fuzeile"/>
+      <w:pStyle w:val="Footer"/>
       <w:rPr>
         <w:lang w:val="de-DE"/>
       </w:rPr>
@@ -3778,7 +3628,7 @@
 </file>
 
 <file path=word/footnotes.xml><?xml version="1.0" encoding="utf-8"?>
-<w:footnotes xmlns:wpc="http://schemas.microsoft.com/office/word/2010/wordprocessingCanvas" xmlns:cx="http://schemas.microsoft.com/office/drawing/2014/chartex" xmlns:cx1="http://schemas.microsoft.com/office/drawing/2015/9/8/chartex" xmlns:cx2="http://schemas.microsoft.com/office/drawing/2015/10/21/chartex" xmlns:cx3="http://schemas.microsoft.com/office/drawing/2016/5/9/chartex" xmlns:cx4="http://schemas.microsoft.com/office/drawing/2016/5/10/chartex" xmlns:cx5="http://schemas.microsoft.com/office/drawing/2016/5/11/chartex" xmlns:cx6="http://schemas.microsoft.com/office/drawing/2016/5/12/chartex" xmlns:cx7="http://schemas.microsoft.com/office/drawing/2016/5/13/chartex" xmlns:cx8="http://schemas.microsoft.com/office/drawing/2016/5/14/chartex" xmlns:mc="http://schemas.openxmlformats.org/markup-compatibility/2006" xmlns:aink="http://schemas.microsoft.com/office/drawing/2016/ink" xmlns:am3d="http://schemas.microsoft.com/office/drawing/2017/model3d" xmlns:o="urn:schemas-microsoft-com:office:office" xmlns:oel="http://schemas.microsoft.com/office/2019/extlst" xmlns:r="http://schemas.openxmlformats.org/officeDocument/2006/relationships" xmlns:m="http://schemas.openxmlformats.org/officeDocument/2006/math" xmlns:v="urn:schemas-microsoft-com:vml" xmlns:wp14="http://schemas.microsoft.com/office/word/2010/wordprocessingDrawing" xmlns:wp="http://schemas.openxmlformats.org/drawingml/2006/wordprocessingDrawing" xmlns:w10="urn:schemas-microsoft-com:office:word" xmlns:w="http://schemas.openxmlformats.org/wordprocessingml/2006/main" xmlns:w14="http://schemas.microsoft.com/office/word/2010/wordml" xmlns:w15="http://schemas.microsoft.com/office/word/2012/wordml" xmlns:w16cex="http://schemas.microsoft.com/office/word/2018/wordml/cex" xmlns:w16cid="http://schemas.microsoft.com/office/word/2016/wordml/cid" xmlns:w16="http://schemas.microsoft.com/office/word/2018/wordml" xmlns:w16sdtdh="http://schemas.microsoft.com/office/word/2020/wordml/sdtdatahash" xmlns:w16se="http://schemas.microsoft.com/office/word/2015/wordml/symex" xmlns:wpg="http://schemas.microsoft.com/office/word/2010/wordprocessingGroup" xmlns:wpi="http://schemas.microsoft.com/office/word/2010/wordprocessingInk" xmlns:wne="http://schemas.microsoft.com/office/word/2006/wordml" xmlns:wps="http://schemas.microsoft.com/office/word/2010/wordprocessingShape" mc:Ignorable="w14 w15 w16se w16cid w16 w16cex w16sdtdh wp14">
+<w:footnotes xmlns:wpc="http://schemas.microsoft.com/office/word/2010/wordprocessingCanvas" xmlns:cx="http://schemas.microsoft.com/office/drawing/2014/chartex" xmlns:cx1="http://schemas.microsoft.com/office/drawing/2015/9/8/chartex" xmlns:cx2="http://schemas.microsoft.com/office/drawing/2015/10/21/chartex" xmlns:cx3="http://schemas.microsoft.com/office/drawing/2016/5/9/chartex" xmlns:cx4="http://schemas.microsoft.com/office/drawing/2016/5/10/chartex" xmlns:cx5="http://schemas.microsoft.com/office/drawing/2016/5/11/chartex" xmlns:cx6="http://schemas.microsoft.com/office/drawing/2016/5/12/chartex" xmlns:cx7="http://schemas.microsoft.com/office/drawing/2016/5/13/chartex" xmlns:cx8="http://schemas.microsoft.com/office/drawing/2016/5/14/chartex" xmlns:mc="http://schemas.openxmlformats.org/markup-compatibility/2006" xmlns:aink="http://schemas.microsoft.com/office/drawing/2016/ink" xmlns:am3d="http://schemas.microsoft.com/office/drawing/2017/model3d" xmlns:o="urn:schemas-microsoft-com:office:office" xmlns:oel="http://schemas.microsoft.com/office/2019/extlst" xmlns:r="http://schemas.openxmlformats.org/officeDocument/2006/relationships" xmlns:m="http://schemas.openxmlformats.org/officeDocument/2006/math" xmlns:v="urn:schemas-microsoft-com:vml" xmlns:wp14="http://schemas.microsoft.com/office/word/2010/wordprocessingDrawing" xmlns:wp="http://schemas.openxmlformats.org/drawingml/2006/wordprocessingDrawing" xmlns:w10="urn:schemas-microsoft-com:office:word" xmlns:w="http://schemas.openxmlformats.org/wordprocessingml/2006/main" xmlns:w14="http://schemas.microsoft.com/office/word/2010/wordml" xmlns:w15="http://schemas.microsoft.com/office/word/2012/wordml" xmlns:w16cex="http://schemas.microsoft.com/office/word/2018/wordml/cex" xmlns:w16cid="http://schemas.microsoft.com/office/word/2016/wordml/cid" xmlns:w16="http://schemas.microsoft.com/office/word/2018/wordml" xmlns:w16du="http://schemas.microsoft.com/office/word/2023/wordml/word16du" xmlns:w16sdtdh="http://schemas.microsoft.com/office/word/2020/wordml/sdtdatahash" xmlns:w16sdtfl="http://schemas.microsoft.com/office/word/2024/wordml/sdtformatlock" xmlns:w16se="http://schemas.microsoft.com/office/word/2015/wordml/symex" xmlns:wpg="http://schemas.microsoft.com/office/word/2010/wordprocessingGroup" xmlns:wpi="http://schemas.microsoft.com/office/word/2010/wordprocessingInk" xmlns:wne="http://schemas.microsoft.com/office/word/2006/wordml" xmlns:wps="http://schemas.microsoft.com/office/word/2010/wordprocessingShape" mc:Ignorable="w14 w15 w16se w16cid w16 w16cex w16sdtdh w16sdtfl w16du wp14">
   <w:footnote w:type="separator" w:id="-1">
     <w:p>
       <w:r>
@@ -3797,17 +3647,17 @@
 </file>
 
 <file path=word/header1.xml><?xml version="1.0" encoding="utf-8"?>
-<w:hdr xmlns:wpc="http://schemas.microsoft.com/office/word/2010/wordprocessingCanvas" xmlns:cx="http://schemas.microsoft.com/office/drawing/2014/chartex" xmlns:cx1="http://schemas.microsoft.com/office/drawing/2015/9/8/chartex" xmlns:cx2="http://schemas.microsoft.com/office/drawing/2015/10/21/chartex" xmlns:cx3="http://schemas.microsoft.com/office/drawing/2016/5/9/chartex" xmlns:cx4="http://schemas.microsoft.com/office/drawing/2016/5/10/chartex" xmlns:cx5="http://schemas.microsoft.com/office/drawing/2016/5/11/chartex" xmlns:cx6="http://schemas.microsoft.com/office/drawing/2016/5/12/chartex" xmlns:cx7="http://schemas.microsoft.com/office/drawing/2016/5/13/chartex" xmlns:cx8="http://schemas.microsoft.com/office/drawing/2016/5/14/chartex" xmlns:mc="http://schemas.openxmlformats.org/markup-compatibility/2006" xmlns:aink="http://schemas.microsoft.com/office/drawing/2016/ink" xmlns:am3d="http://schemas.microsoft.com/office/drawing/2017/model3d" xmlns:o="urn:schemas-microsoft-com:office:office" xmlns:oel="http://schemas.microsoft.com/office/2019/extlst" xmlns:r="http://schemas.openxmlformats.org/officeDocument/2006/relationships" xmlns:m="http://schemas.openxmlformats.org/officeDocument/2006/math" xmlns:v="urn:schemas-microsoft-com:vml" xmlns:wp14="http://schemas.microsoft.com/office/word/2010/wordprocessingDrawing" xmlns:wp="http://schemas.openxmlformats.org/drawingml/2006/wordprocessingDrawing" xmlns:w10="urn:schemas-microsoft-com:office:word" xmlns:w="http://schemas.openxmlformats.org/wordprocessingml/2006/main" xmlns:w14="http://schemas.microsoft.com/office/word/2010/wordml" xmlns:w15="http://schemas.microsoft.com/office/word/2012/wordml" xmlns:w16cex="http://schemas.microsoft.com/office/word/2018/wordml/cex" xmlns:w16cid="http://schemas.microsoft.com/office/word/2016/wordml/cid" xmlns:w16="http://schemas.microsoft.com/office/word/2018/wordml" xmlns:w16sdtdh="http://schemas.microsoft.com/office/word/2020/wordml/sdtdatahash" xmlns:w16se="http://schemas.microsoft.com/office/word/2015/wordml/symex" xmlns:wpg="http://schemas.microsoft.com/office/word/2010/wordprocessingGroup" xmlns:wpi="http://schemas.microsoft.com/office/word/2010/wordprocessingInk" xmlns:wne="http://schemas.microsoft.com/office/word/2006/wordml" xmlns:wps="http://schemas.microsoft.com/office/word/2010/wordprocessingShape" mc:Ignorable="w14 w15 w16se w16cid w16 w16cex w16sdtdh wp14">
+<w:hdr xmlns:wpc="http://schemas.microsoft.com/office/word/2010/wordprocessingCanvas" xmlns:cx="http://schemas.microsoft.com/office/drawing/2014/chartex" xmlns:cx1="http://schemas.microsoft.com/office/drawing/2015/9/8/chartex" xmlns:cx2="http://schemas.microsoft.com/office/drawing/2015/10/21/chartex" xmlns:cx3="http://schemas.microsoft.com/office/drawing/2016/5/9/chartex" xmlns:cx4="http://schemas.microsoft.com/office/drawing/2016/5/10/chartex" xmlns:cx5="http://schemas.microsoft.com/office/drawing/2016/5/11/chartex" xmlns:cx6="http://schemas.microsoft.com/office/drawing/2016/5/12/chartex" xmlns:cx7="http://schemas.microsoft.com/office/drawing/2016/5/13/chartex" xmlns:cx8="http://schemas.microsoft.com/office/drawing/2016/5/14/chartex" xmlns:mc="http://schemas.openxmlformats.org/markup-compatibility/2006" xmlns:aink="http://schemas.microsoft.com/office/drawing/2016/ink" xmlns:am3d="http://schemas.microsoft.com/office/drawing/2017/model3d" xmlns:o="urn:schemas-microsoft-com:office:office" xmlns:oel="http://schemas.microsoft.com/office/2019/extlst" xmlns:r="http://schemas.openxmlformats.org/officeDocument/2006/relationships" xmlns:m="http://schemas.openxmlformats.org/officeDocument/2006/math" xmlns:v="urn:schemas-microsoft-com:vml" xmlns:wp14="http://schemas.microsoft.com/office/word/2010/wordprocessingDrawing" xmlns:wp="http://schemas.openxmlformats.org/drawingml/2006/wordprocessingDrawing" xmlns:w10="urn:schemas-microsoft-com:office:word" xmlns:w="http://schemas.openxmlformats.org/wordprocessingml/2006/main" xmlns:w14="http://schemas.microsoft.com/office/word/2010/wordml" xmlns:w15="http://schemas.microsoft.com/office/word/2012/wordml" xmlns:w16cex="http://schemas.microsoft.com/office/word/2018/wordml/cex" xmlns:w16cid="http://schemas.microsoft.com/office/word/2016/wordml/cid" xmlns:w16="http://schemas.microsoft.com/office/word/2018/wordml" xmlns:w16du="http://schemas.microsoft.com/office/word/2023/wordml/word16du" xmlns:w16sdtdh="http://schemas.microsoft.com/office/word/2020/wordml/sdtdatahash" xmlns:w16sdtfl="http://schemas.microsoft.com/office/word/2024/wordml/sdtformatlock" xmlns:w16se="http://schemas.microsoft.com/office/word/2015/wordml/symex" xmlns:wpg="http://schemas.microsoft.com/office/word/2010/wordprocessingGroup" xmlns:wpi="http://schemas.microsoft.com/office/word/2010/wordprocessingInk" xmlns:wne="http://schemas.microsoft.com/office/word/2006/wordml" xmlns:wps="http://schemas.microsoft.com/office/word/2010/wordprocessingShape" mc:Ignorable="w14 w15 w16se w16cid w16 w16cex w16sdtdh w16sdtfl w16du wp14">
   <w:p>
     <w:pPr>
-      <w:pStyle w:val="Kopfzeile"/>
+      <w:pStyle w:val="Header"/>
     </w:pPr>
   </w:p>
 </w:hdr>
 </file>
 
 <file path=word/header2.xml><?xml version="1.0" encoding="utf-8"?>
-<w:hdr xmlns:wpc="http://schemas.microsoft.com/office/word/2010/wordprocessingCanvas" xmlns:cx="http://schemas.microsoft.com/office/drawing/2014/chartex" xmlns:cx1="http://schemas.microsoft.com/office/drawing/2015/9/8/chartex" xmlns:cx2="http://schemas.microsoft.com/office/drawing/2015/10/21/chartex" xmlns:cx3="http://schemas.microsoft.com/office/drawing/2016/5/9/chartex" xmlns:cx4="http://schemas.microsoft.com/office/drawing/2016/5/10/chartex" xmlns:cx5="http://schemas.microsoft.com/office/drawing/2016/5/11/chartex" xmlns:cx6="http://schemas.microsoft.com/office/drawing/2016/5/12/chartex" xmlns:cx7="http://schemas.microsoft.com/office/drawing/2016/5/13/chartex" xmlns:cx8="http://schemas.microsoft.com/office/drawing/2016/5/14/chartex" xmlns:mc="http://schemas.openxmlformats.org/markup-compatibility/2006" xmlns:aink="http://schemas.microsoft.com/office/drawing/2016/ink" xmlns:am3d="http://schemas.microsoft.com/office/drawing/2017/model3d" xmlns:o="urn:schemas-microsoft-com:office:office" xmlns:oel="http://schemas.microsoft.com/office/2019/extlst" xmlns:r="http://schemas.openxmlformats.org/officeDocument/2006/relationships" xmlns:m="http://schemas.openxmlformats.org/officeDocument/2006/math" xmlns:v="urn:schemas-microsoft-com:vml" xmlns:wp14="http://schemas.microsoft.com/office/word/2010/wordprocessingDrawing" xmlns:wp="http://schemas.openxmlformats.org/drawingml/2006/wordprocessingDrawing" xmlns:w10="urn:schemas-microsoft-com:office:word" xmlns:w="http://schemas.openxmlformats.org/wordprocessingml/2006/main" xmlns:w14="http://schemas.microsoft.com/office/word/2010/wordml" xmlns:w15="http://schemas.microsoft.com/office/word/2012/wordml" xmlns:w16cex="http://schemas.microsoft.com/office/word/2018/wordml/cex" xmlns:w16cid="http://schemas.microsoft.com/office/word/2016/wordml/cid" xmlns:w16="http://schemas.microsoft.com/office/word/2018/wordml" xmlns:w16sdtdh="http://schemas.microsoft.com/office/word/2020/wordml/sdtdatahash" xmlns:w16se="http://schemas.microsoft.com/office/word/2015/wordml/symex" xmlns:wpg="http://schemas.microsoft.com/office/word/2010/wordprocessingGroup" xmlns:wpi="http://schemas.microsoft.com/office/word/2010/wordprocessingInk" xmlns:wne="http://schemas.microsoft.com/office/word/2006/wordml" xmlns:wps="http://schemas.microsoft.com/office/word/2010/wordprocessingShape" mc:Ignorable="w14 w15 w16se w16cid w16 w16cex w16sdtdh wp14">
+<w:hdr xmlns:wpc="http://schemas.microsoft.com/office/word/2010/wordprocessingCanvas" xmlns:cx="http://schemas.microsoft.com/office/drawing/2014/chartex" xmlns:cx1="http://schemas.microsoft.com/office/drawing/2015/9/8/chartex" xmlns:cx2="http://schemas.microsoft.com/office/drawing/2015/10/21/chartex" xmlns:cx3="http://schemas.microsoft.com/office/drawing/2016/5/9/chartex" xmlns:cx4="http://schemas.microsoft.com/office/drawing/2016/5/10/chartex" xmlns:cx5="http://schemas.microsoft.com/office/drawing/2016/5/11/chartex" xmlns:cx6="http://schemas.microsoft.com/office/drawing/2016/5/12/chartex" xmlns:cx7="http://schemas.microsoft.com/office/drawing/2016/5/13/chartex" xmlns:cx8="http://schemas.microsoft.com/office/drawing/2016/5/14/chartex" xmlns:mc="http://schemas.openxmlformats.org/markup-compatibility/2006" xmlns:aink="http://schemas.microsoft.com/office/drawing/2016/ink" xmlns:am3d="http://schemas.microsoft.com/office/drawing/2017/model3d" xmlns:o="urn:schemas-microsoft-com:office:office" xmlns:oel="http://schemas.microsoft.com/office/2019/extlst" xmlns:r="http://schemas.openxmlformats.org/officeDocument/2006/relationships" xmlns:m="http://schemas.openxmlformats.org/officeDocument/2006/math" xmlns:v="urn:schemas-microsoft-com:vml" xmlns:wp14="http://schemas.microsoft.com/office/word/2010/wordprocessingDrawing" xmlns:wp="http://schemas.openxmlformats.org/drawingml/2006/wordprocessingDrawing" xmlns:w10="urn:schemas-microsoft-com:office:word" xmlns:w="http://schemas.openxmlformats.org/wordprocessingml/2006/main" xmlns:w14="http://schemas.microsoft.com/office/word/2010/wordml" xmlns:w15="http://schemas.microsoft.com/office/word/2012/wordml" xmlns:w16cex="http://schemas.microsoft.com/office/word/2018/wordml/cex" xmlns:w16cid="http://schemas.microsoft.com/office/word/2016/wordml/cid" xmlns:w16="http://schemas.microsoft.com/office/word/2018/wordml" xmlns:w16du="http://schemas.microsoft.com/office/word/2023/wordml/word16du" xmlns:w16sdtdh="http://schemas.microsoft.com/office/word/2020/wordml/sdtdatahash" xmlns:w16sdtfl="http://schemas.microsoft.com/office/word/2024/wordml/sdtformatlock" xmlns:w16se="http://schemas.microsoft.com/office/word/2015/wordml/symex" xmlns:wpg="http://schemas.microsoft.com/office/word/2010/wordprocessingGroup" xmlns:wpi="http://schemas.microsoft.com/office/word/2010/wordprocessingInk" xmlns:wne="http://schemas.microsoft.com/office/word/2006/wordml" xmlns:wps="http://schemas.microsoft.com/office/word/2010/wordprocessingShape" mc:Ignorable="w14 w15 w16se w16cid w16 w16cex w16sdtdh w16sdtfl w16du wp14">
   <w:tbl>
     <w:tblPr>
       <w:tblW w:w="9250" w:type="dxa"/>
@@ -4191,21 +4041,11 @@
           <w:r>
             <w:t xml:space="preserve">Version </w:t>
           </w:r>
-          <w:r>
-            <w:fldChar w:fldCharType="begin"/>
-          </w:r>
-          <w:r>
-            <w:instrText xml:space="preserve"> DOCPROPERTY "Version"  \* MERGEFORMAT </w:instrText>
-          </w:r>
-          <w:r>
-            <w:fldChar w:fldCharType="separate"/>
-          </w:r>
-          <w:r>
-            <w:t>TEMPLATE</w:t>
-          </w:r>
-          <w:r>
-            <w:fldChar w:fldCharType="end"/>
-          </w:r>
+          <w:fldSimple w:instr=" DOCPROPERTY &quot;Version&quot;  \* MERGEFORMAT ">
+            <w:r>
+              <w:t>TEMPLATE</w:t>
+            </w:r>
+          </w:fldSimple>
         </w:p>
       </w:tc>
       <w:tc>
@@ -4343,24 +4183,24 @@
   </w:tbl>
   <w:p>
     <w:pPr>
-      <w:pStyle w:val="Kopfzeile"/>
+      <w:pStyle w:val="Header"/>
     </w:pPr>
   </w:p>
 </w:hdr>
 </file>
 
 <file path=word/header3.xml><?xml version="1.0" encoding="utf-8"?>
-<w:hdr xmlns:wpc="http://schemas.microsoft.com/office/word/2010/wordprocessingCanvas" xmlns:cx="http://schemas.microsoft.com/office/drawing/2014/chartex" xmlns:cx1="http://schemas.microsoft.com/office/drawing/2015/9/8/chartex" xmlns:cx2="http://schemas.microsoft.com/office/drawing/2015/10/21/chartex" xmlns:cx3="http://schemas.microsoft.com/office/drawing/2016/5/9/chartex" xmlns:cx4="http://schemas.microsoft.com/office/drawing/2016/5/10/chartex" xmlns:cx5="http://schemas.microsoft.com/office/drawing/2016/5/11/chartex" xmlns:cx6="http://schemas.microsoft.com/office/drawing/2016/5/12/chartex" xmlns:cx7="http://schemas.microsoft.com/office/drawing/2016/5/13/chartex" xmlns:cx8="http://schemas.microsoft.com/office/drawing/2016/5/14/chartex" xmlns:mc="http://schemas.openxmlformats.org/markup-compatibility/2006" xmlns:aink="http://schemas.microsoft.com/office/drawing/2016/ink" xmlns:am3d="http://schemas.microsoft.com/office/drawing/2017/model3d" xmlns:o="urn:schemas-microsoft-com:office:office" xmlns:oel="http://schemas.microsoft.com/office/2019/extlst" xmlns:r="http://schemas.openxmlformats.org/officeDocument/2006/relationships" xmlns:m="http://schemas.openxmlformats.org/officeDocument/2006/math" xmlns:v="urn:schemas-microsoft-com:vml" xmlns:wp14="http://schemas.microsoft.com/office/word/2010/wordprocessingDrawing" xmlns:wp="http://schemas.openxmlformats.org/drawingml/2006/wordprocessingDrawing" xmlns:w10="urn:schemas-microsoft-com:office:word" xmlns:w="http://schemas.openxmlformats.org/wordprocessingml/2006/main" xmlns:w14="http://schemas.microsoft.com/office/word/2010/wordml" xmlns:w15="http://schemas.microsoft.com/office/word/2012/wordml" xmlns:w16cex="http://schemas.microsoft.com/office/word/2018/wordml/cex" xmlns:w16cid="http://schemas.microsoft.com/office/word/2016/wordml/cid" xmlns:w16="http://schemas.microsoft.com/office/word/2018/wordml" xmlns:w16sdtdh="http://schemas.microsoft.com/office/word/2020/wordml/sdtdatahash" xmlns:w16se="http://schemas.microsoft.com/office/word/2015/wordml/symex" xmlns:wpg="http://schemas.microsoft.com/office/word/2010/wordprocessingGroup" xmlns:wpi="http://schemas.microsoft.com/office/word/2010/wordprocessingInk" xmlns:wne="http://schemas.microsoft.com/office/word/2006/wordml" xmlns:wps="http://schemas.microsoft.com/office/word/2010/wordprocessingShape" mc:Ignorable="w14 w15 w16se w16cid w16 w16cex w16sdtdh wp14">
+<w:hdr xmlns:wpc="http://schemas.microsoft.com/office/word/2010/wordprocessingCanvas" xmlns:cx="http://schemas.microsoft.com/office/drawing/2014/chartex" xmlns:cx1="http://schemas.microsoft.com/office/drawing/2015/9/8/chartex" xmlns:cx2="http://schemas.microsoft.com/office/drawing/2015/10/21/chartex" xmlns:cx3="http://schemas.microsoft.com/office/drawing/2016/5/9/chartex" xmlns:cx4="http://schemas.microsoft.com/office/drawing/2016/5/10/chartex" xmlns:cx5="http://schemas.microsoft.com/office/drawing/2016/5/11/chartex" xmlns:cx6="http://schemas.microsoft.com/office/drawing/2016/5/12/chartex" xmlns:cx7="http://schemas.microsoft.com/office/drawing/2016/5/13/chartex" xmlns:cx8="http://schemas.microsoft.com/office/drawing/2016/5/14/chartex" xmlns:mc="http://schemas.openxmlformats.org/markup-compatibility/2006" xmlns:aink="http://schemas.microsoft.com/office/drawing/2016/ink" xmlns:am3d="http://schemas.microsoft.com/office/drawing/2017/model3d" xmlns:o="urn:schemas-microsoft-com:office:office" xmlns:oel="http://schemas.microsoft.com/office/2019/extlst" xmlns:r="http://schemas.openxmlformats.org/officeDocument/2006/relationships" xmlns:m="http://schemas.openxmlformats.org/officeDocument/2006/math" xmlns:v="urn:schemas-microsoft-com:vml" xmlns:wp14="http://schemas.microsoft.com/office/word/2010/wordprocessingDrawing" xmlns:wp="http://schemas.openxmlformats.org/drawingml/2006/wordprocessingDrawing" xmlns:w10="urn:schemas-microsoft-com:office:word" xmlns:w="http://schemas.openxmlformats.org/wordprocessingml/2006/main" xmlns:w14="http://schemas.microsoft.com/office/word/2010/wordml" xmlns:w15="http://schemas.microsoft.com/office/word/2012/wordml" xmlns:w16cex="http://schemas.microsoft.com/office/word/2018/wordml/cex" xmlns:w16cid="http://schemas.microsoft.com/office/word/2016/wordml/cid" xmlns:w16="http://schemas.microsoft.com/office/word/2018/wordml" xmlns:w16du="http://schemas.microsoft.com/office/word/2023/wordml/word16du" xmlns:w16sdtdh="http://schemas.microsoft.com/office/word/2020/wordml/sdtdatahash" xmlns:w16sdtfl="http://schemas.microsoft.com/office/word/2024/wordml/sdtformatlock" xmlns:w16se="http://schemas.microsoft.com/office/word/2015/wordml/symex" xmlns:wpg="http://schemas.microsoft.com/office/word/2010/wordprocessingGroup" xmlns:wpi="http://schemas.microsoft.com/office/word/2010/wordprocessingInk" xmlns:wne="http://schemas.microsoft.com/office/word/2006/wordml" xmlns:wps="http://schemas.microsoft.com/office/word/2010/wordprocessingShape" mc:Ignorable="w14 w15 w16se w16cid w16 w16cex w16sdtdh w16sdtfl w16du wp14">
   <w:p>
     <w:pPr>
-      <w:pStyle w:val="Kopfzeile"/>
+      <w:pStyle w:val="Header"/>
     </w:pPr>
   </w:p>
 </w:hdr>
 </file>
 
 <file path=word/numbering.xml><?xml version="1.0" encoding="utf-8"?>
-<w:numbering xmlns:wpc="http://schemas.microsoft.com/office/word/2010/wordprocessingCanvas" xmlns:cx="http://schemas.microsoft.com/office/drawing/2014/chartex" xmlns:cx1="http://schemas.microsoft.com/office/drawing/2015/9/8/chartex" xmlns:cx2="http://schemas.microsoft.com/office/drawing/2015/10/21/chartex" xmlns:cx3="http://schemas.microsoft.com/office/drawing/2016/5/9/chartex" xmlns:cx4="http://schemas.microsoft.com/office/drawing/2016/5/10/chartex" xmlns:cx5="http://schemas.microsoft.com/office/drawing/2016/5/11/chartex" xmlns:cx6="http://schemas.microsoft.com/office/drawing/2016/5/12/chartex" xmlns:cx7="http://schemas.microsoft.com/office/drawing/2016/5/13/chartex" xmlns:cx8="http://schemas.microsoft.com/office/drawing/2016/5/14/chartex" xmlns:mc="http://schemas.openxmlformats.org/markup-compatibility/2006" xmlns:aink="http://schemas.microsoft.com/office/drawing/2016/ink" xmlns:am3d="http://schemas.microsoft.com/office/drawing/2017/model3d" xmlns:o="urn:schemas-microsoft-com:office:office" xmlns:oel="http://schemas.microsoft.com/office/2019/extlst" xmlns:r="http://schemas.openxmlformats.org/officeDocument/2006/relationships" xmlns:m="http://schemas.openxmlformats.org/officeDocument/2006/math" xmlns:v="urn:schemas-microsoft-com:vml" xmlns:wp14="http://schemas.microsoft.com/office/word/2010/wordprocessingDrawing" xmlns:wp="http://schemas.openxmlformats.org/drawingml/2006/wordprocessingDrawing" xmlns:w10="urn:schemas-microsoft-com:office:word" xmlns:w="http://schemas.openxmlformats.org/wordprocessingml/2006/main" xmlns:w14="http://schemas.microsoft.com/office/word/2010/wordml" xmlns:w15="http://schemas.microsoft.com/office/word/2012/wordml" xmlns:w16cex="http://schemas.microsoft.com/office/word/2018/wordml/cex" xmlns:w16cid="http://schemas.microsoft.com/office/word/2016/wordml/cid" xmlns:w16="http://schemas.microsoft.com/office/word/2018/wordml" xmlns:w16sdtdh="http://schemas.microsoft.com/office/word/2020/wordml/sdtdatahash" xmlns:w16se="http://schemas.microsoft.com/office/word/2015/wordml/symex" xmlns:wpg="http://schemas.microsoft.com/office/word/2010/wordprocessingGroup" xmlns:wpi="http://schemas.microsoft.com/office/word/2010/wordprocessingInk" xmlns:wne="http://schemas.microsoft.com/office/word/2006/wordml" xmlns:wps="http://schemas.microsoft.com/office/word/2010/wordprocessingShape" mc:Ignorable="w14 w15 w16se w16cid w16 w16cex w16sdtdh wp14">
+<w:numbering xmlns:wpc="http://schemas.microsoft.com/office/word/2010/wordprocessingCanvas" xmlns:cx="http://schemas.microsoft.com/office/drawing/2014/chartex" xmlns:cx1="http://schemas.microsoft.com/office/drawing/2015/9/8/chartex" xmlns:cx2="http://schemas.microsoft.com/office/drawing/2015/10/21/chartex" xmlns:cx3="http://schemas.microsoft.com/office/drawing/2016/5/9/chartex" xmlns:cx4="http://schemas.microsoft.com/office/drawing/2016/5/10/chartex" xmlns:cx5="http://schemas.microsoft.com/office/drawing/2016/5/11/chartex" xmlns:cx6="http://schemas.microsoft.com/office/drawing/2016/5/12/chartex" xmlns:cx7="http://schemas.microsoft.com/office/drawing/2016/5/13/chartex" xmlns:cx8="http://schemas.microsoft.com/office/drawing/2016/5/14/chartex" xmlns:mc="http://schemas.openxmlformats.org/markup-compatibility/2006" xmlns:aink="http://schemas.microsoft.com/office/drawing/2016/ink" xmlns:am3d="http://schemas.microsoft.com/office/drawing/2017/model3d" xmlns:o="urn:schemas-microsoft-com:office:office" xmlns:oel="http://schemas.microsoft.com/office/2019/extlst" xmlns:r="http://schemas.openxmlformats.org/officeDocument/2006/relationships" xmlns:m="http://schemas.openxmlformats.org/officeDocument/2006/math" xmlns:v="urn:schemas-microsoft-com:vml" xmlns:wp14="http://schemas.microsoft.com/office/word/2010/wordprocessingDrawing" xmlns:wp="http://schemas.openxmlformats.org/drawingml/2006/wordprocessingDrawing" xmlns:w10="urn:schemas-microsoft-com:office:word" xmlns:w="http://schemas.openxmlformats.org/wordprocessingml/2006/main" xmlns:w14="http://schemas.microsoft.com/office/word/2010/wordml" xmlns:w15="http://schemas.microsoft.com/office/word/2012/wordml" xmlns:w16cex="http://schemas.microsoft.com/office/word/2018/wordml/cex" xmlns:w16cid="http://schemas.microsoft.com/office/word/2016/wordml/cid" xmlns:w16="http://schemas.microsoft.com/office/word/2018/wordml" xmlns:w16du="http://schemas.microsoft.com/office/word/2023/wordml/word16du" xmlns:w16sdtdh="http://schemas.microsoft.com/office/word/2020/wordml/sdtdatahash" xmlns:w16sdtfl="http://schemas.microsoft.com/office/word/2024/wordml/sdtformatlock" xmlns:w16se="http://schemas.microsoft.com/office/word/2015/wordml/symex" xmlns:wpg="http://schemas.microsoft.com/office/word/2010/wordprocessingGroup" xmlns:wpi="http://schemas.microsoft.com/office/word/2010/wordprocessingInk" xmlns:wne="http://schemas.microsoft.com/office/word/2006/wordml" xmlns:wps="http://schemas.microsoft.com/office/word/2010/wordprocessingShape" mc:Ignorable="w14 w15 w16se w16cid w16 w16cex w16sdtdh w16sdtfl w16du wp14">
   <w:abstractNum w:abstractNumId="0" w15:restartNumberingAfterBreak="0">
     <w:nsid w:val="116E6F35"/>
     <w:multiLevelType w:val="hybridMultilevel"/>
@@ -4485,7 +4325,7 @@
     <w:lvl w:ilvl="0" w:tplc="FDFE8246">
       <w:start w:val="1"/>
       <w:numFmt w:val="bullet"/>
-      <w:pStyle w:val="Liste2"/>
+      <w:pStyle w:val="List2"/>
       <w:lvlText w:val=""/>
       <w:lvlJc w:val="left"/>
       <w:pPr>
@@ -4767,7 +4607,7 @@
     <w:lvl w:ilvl="0">
       <w:start w:val="1"/>
       <w:numFmt w:val="decimal"/>
-      <w:pStyle w:val="berschrift1"/>
+      <w:pStyle w:val="Heading1"/>
       <w:lvlText w:val="%1"/>
       <w:lvlJc w:val="left"/>
       <w:pPr>
@@ -4783,7 +4623,7 @@
     <w:lvl w:ilvl="1">
       <w:start w:val="1"/>
       <w:numFmt w:val="decimal"/>
-      <w:pStyle w:val="berschrift2"/>
+      <w:pStyle w:val="Heading2"/>
       <w:lvlText w:val="%1.%2"/>
       <w:lvlJc w:val="left"/>
       <w:pPr>
@@ -4799,7 +4639,7 @@
     <w:lvl w:ilvl="2">
       <w:start w:val="1"/>
       <w:numFmt w:val="decimal"/>
-      <w:pStyle w:val="berschrift3"/>
+      <w:pStyle w:val="Heading3"/>
       <w:lvlText w:val="%1.%2.%3"/>
       <w:lvlJc w:val="left"/>
       <w:pPr>
@@ -5457,7 +5297,7 @@
     <w:lvl w:ilvl="0" w:tplc="29C828CC">
       <w:start w:val="1"/>
       <w:numFmt w:val="bullet"/>
-      <w:pStyle w:val="Liste3"/>
+      <w:pStyle w:val="List3"/>
       <w:lvlText w:val=""/>
       <w:lvlJc w:val="left"/>
       <w:pPr>
@@ -6073,7 +5913,7 @@
 </file>
 
 <file path=word/styles.xml><?xml version="1.0" encoding="utf-8"?>
-<w:styles xmlns:mc="http://schemas.openxmlformats.org/markup-compatibility/2006" xmlns:r="http://schemas.openxmlformats.org/officeDocument/2006/relationships" xmlns:w="http://schemas.openxmlformats.org/wordprocessingml/2006/main" xmlns:w14="http://schemas.microsoft.com/office/word/2010/wordml" xmlns:w15="http://schemas.microsoft.com/office/word/2012/wordml" xmlns:w16cex="http://schemas.microsoft.com/office/word/2018/wordml/cex" xmlns:w16cid="http://schemas.microsoft.com/office/word/2016/wordml/cid" xmlns:w16="http://schemas.microsoft.com/office/word/2018/wordml" xmlns:w16sdtdh="http://schemas.microsoft.com/office/word/2020/wordml/sdtdatahash" xmlns:w16se="http://schemas.microsoft.com/office/word/2015/wordml/symex" mc:Ignorable="w14 w15 w16se w16cid w16 w16cex w16sdtdh">
+<w:styles xmlns:mc="http://schemas.openxmlformats.org/markup-compatibility/2006" xmlns:r="http://schemas.openxmlformats.org/officeDocument/2006/relationships" xmlns:w="http://schemas.openxmlformats.org/wordprocessingml/2006/main" xmlns:w14="http://schemas.microsoft.com/office/word/2010/wordml" xmlns:w15="http://schemas.microsoft.com/office/word/2012/wordml" xmlns:w16cex="http://schemas.microsoft.com/office/word/2018/wordml/cex" xmlns:w16cid="http://schemas.microsoft.com/office/word/2016/wordml/cid" xmlns:w16="http://schemas.microsoft.com/office/word/2018/wordml" xmlns:w16du="http://schemas.microsoft.com/office/word/2023/wordml/word16du" xmlns:w16sdtdh="http://schemas.microsoft.com/office/word/2020/wordml/sdtdatahash" xmlns:w16sdtfl="http://schemas.microsoft.com/office/word/2024/wordml/sdtformatlock" xmlns:w16se="http://schemas.microsoft.com/office/word/2015/wordml/symex" mc:Ignorable="w14 w15 w16se w16cid w16 w16cex w16sdtdh w16sdtfl w16du">
   <w:docDefaults>
     <w:rPrDefault>
       <w:rPr>
@@ -6461,7 +6301,7 @@
     <w:lsdException w:name="Unresolved Mention" w:semiHidden="1" w:unhideWhenUsed="1"/>
     <w:lsdException w:name="Smart Link" w:semiHidden="1" w:unhideWhenUsed="1"/>
   </w:latentStyles>
-  <w:style w:type="paragraph" w:default="1" w:styleId="Standard">
+  <w:style w:type="paragraph" w:default="1" w:styleId="Normal">
     <w:name w:val="Normal"/>
     <w:qFormat/>
     <w:rsid w:val="0058034D"/>
@@ -6471,7 +6311,7 @@
       <w:lang w:val="en-US"/>
     </w:rPr>
   </w:style>
-  <w:style w:type="paragraph" w:styleId="berschrift1">
+  <w:style w:type="paragraph" w:styleId="Heading1">
     <w:name w:val="heading 1"/>
     <w:next w:val="Text1"/>
     <w:qFormat/>
@@ -6495,7 +6335,7 @@
       <w:szCs w:val="32"/>
     </w:rPr>
   </w:style>
-  <w:style w:type="paragraph" w:styleId="berschrift2">
+  <w:style w:type="paragraph" w:styleId="Heading2">
     <w:name w:val="heading 2"/>
     <w:next w:val="Text2"/>
     <w:qFormat/>
@@ -6517,7 +6357,7 @@
       <w:szCs w:val="28"/>
     </w:rPr>
   </w:style>
-  <w:style w:type="paragraph" w:styleId="berschrift3">
+  <w:style w:type="paragraph" w:styleId="Heading3">
     <w:name w:val="heading 3"/>
     <w:next w:val="Text3"/>
     <w:qFormat/>
@@ -6541,9 +6381,9 @@
       <w:sz w:val="24"/>
     </w:rPr>
   </w:style>
-  <w:style w:type="paragraph" w:styleId="berschrift4">
+  <w:style w:type="paragraph" w:styleId="Heading4">
     <w:name w:val="heading 4"/>
-    <w:basedOn w:val="Standard"/>
+    <w:basedOn w:val="Normal"/>
     <w:next w:val="Text4"/>
     <w:qFormat/>
     <w:pPr>
@@ -6559,10 +6399,10 @@
       <w:szCs w:val="28"/>
     </w:rPr>
   </w:style>
-  <w:style w:type="paragraph" w:styleId="berschrift5">
+  <w:style w:type="paragraph" w:styleId="Heading5">
     <w:name w:val="heading 5"/>
-    <w:basedOn w:val="Standard"/>
-    <w:next w:val="Standard"/>
+    <w:basedOn w:val="Normal"/>
+    <w:next w:val="Normal"/>
     <w:qFormat/>
     <w:pPr>
       <w:keepNext/>
@@ -6574,10 +6414,10 @@
       <w:sz w:val="22"/>
     </w:rPr>
   </w:style>
-  <w:style w:type="paragraph" w:styleId="berschrift6">
+  <w:style w:type="paragraph" w:styleId="Heading6">
     <w:name w:val="heading 6"/>
-    <w:basedOn w:val="Standard"/>
-    <w:next w:val="Standard"/>
+    <w:basedOn w:val="Normal"/>
+    <w:next w:val="Normal"/>
     <w:qFormat/>
     <w:pPr>
       <w:keepNext/>
@@ -6589,10 +6429,10 @@
       <w:bCs/>
     </w:rPr>
   </w:style>
-  <w:style w:type="paragraph" w:styleId="berschrift7">
+  <w:style w:type="paragraph" w:styleId="Heading7">
     <w:name w:val="heading 7"/>
-    <w:basedOn w:val="Standard"/>
-    <w:next w:val="Standard"/>
+    <w:basedOn w:val="Normal"/>
+    <w:next w:val="Normal"/>
     <w:qFormat/>
     <w:pPr>
       <w:spacing w:before="240" w:after="60"/>
@@ -6603,10 +6443,10 @@
       <w:sz w:val="24"/>
     </w:rPr>
   </w:style>
-  <w:style w:type="paragraph" w:styleId="berschrift8">
+  <w:style w:type="paragraph" w:styleId="Heading8">
     <w:name w:val="heading 8"/>
-    <w:basedOn w:val="Standard"/>
-    <w:next w:val="Standard"/>
+    <w:basedOn w:val="Normal"/>
+    <w:next w:val="Normal"/>
     <w:qFormat/>
     <w:pPr>
       <w:keepNext/>
@@ -6619,10 +6459,10 @@
       <w:lang w:val="de-DE"/>
     </w:rPr>
   </w:style>
-  <w:style w:type="paragraph" w:styleId="berschrift9">
+  <w:style w:type="paragraph" w:styleId="Heading9">
     <w:name w:val="heading 9"/>
-    <w:basedOn w:val="Standard"/>
-    <w:next w:val="Standard"/>
+    <w:basedOn w:val="Normal"/>
+    <w:next w:val="Normal"/>
     <w:qFormat/>
     <w:pPr>
       <w:spacing w:before="240" w:after="60"/>
@@ -6634,13 +6474,13 @@
       <w:szCs w:val="22"/>
     </w:rPr>
   </w:style>
-  <w:style w:type="character" w:default="1" w:styleId="Absatz-Standardschriftart">
+  <w:style w:type="character" w:default="1" w:styleId="DefaultParagraphFont">
     <w:name w:val="Default Paragraph Font"/>
     <w:uiPriority w:val="1"/>
     <w:semiHidden/>
     <w:unhideWhenUsed/>
   </w:style>
-  <w:style w:type="table" w:default="1" w:styleId="NormaleTabelle">
+  <w:style w:type="table" w:default="1" w:styleId="TableNormal">
     <w:name w:val="Normal Table"/>
     <w:uiPriority w:val="99"/>
     <w:semiHidden/>
@@ -6655,7 +6495,7 @@
       </w:tblCellMar>
     </w:tblPr>
   </w:style>
-  <w:style w:type="numbering" w:default="1" w:styleId="KeineListe">
+  <w:style w:type="numbering" w:default="1" w:styleId="NoList">
     <w:name w:val="No List"/>
     <w:uiPriority w:val="99"/>
     <w:semiHidden/>
@@ -6698,9 +6538,9 @@
       <w:rFonts w:ascii="Arial" w:hAnsi="Arial"/>
     </w:rPr>
   </w:style>
-  <w:style w:type="paragraph" w:styleId="Fuzeile">
+  <w:style w:type="paragraph" w:styleId="Footer">
     <w:name w:val="footer"/>
-    <w:basedOn w:val="Standard"/>
+    <w:basedOn w:val="Normal"/>
     <w:pPr>
       <w:tabs>
         <w:tab w:val="center" w:pos="4536"/>
@@ -6716,9 +6556,9 @@
       <w:u w:val="single"/>
     </w:rPr>
   </w:style>
-  <w:style w:type="paragraph" w:styleId="Kopfzeile">
+  <w:style w:type="paragraph" w:styleId="Header">
     <w:name w:val="header"/>
-    <w:basedOn w:val="Standard"/>
+    <w:basedOn w:val="Normal"/>
     <w:pPr>
       <w:tabs>
         <w:tab w:val="center" w:pos="4536"/>
@@ -6739,7 +6579,7 @@
       <w:rFonts w:ascii="Arial" w:hAnsi="Arial"/>
     </w:rPr>
   </w:style>
-  <w:style w:type="paragraph" w:styleId="Liste2">
+  <w:style w:type="paragraph" w:styleId="List2">
     <w:name w:val="List 2"/>
     <w:pPr>
       <w:numPr>
@@ -6751,7 +6591,7 @@
       <w:rFonts w:ascii="Arial" w:hAnsi="Arial"/>
     </w:rPr>
   </w:style>
-  <w:style w:type="paragraph" w:styleId="Liste3">
+  <w:style w:type="paragraph" w:styleId="List3">
     <w:name w:val="List 3"/>
     <w:pPr>
       <w:numPr>
@@ -6763,7 +6603,7 @@
       <w:rFonts w:ascii="Arial" w:hAnsi="Arial"/>
     </w:rPr>
   </w:style>
-  <w:style w:type="paragraph" w:styleId="Liste4">
+  <w:style w:type="paragraph" w:styleId="List4">
     <w:name w:val="List 4"/>
     <w:pPr>
       <w:tabs>
@@ -6869,9 +6709,9 @@
       <w:b/>
     </w:rPr>
   </w:style>
-  <w:style w:type="paragraph" w:styleId="Verzeichnis1">
+  <w:style w:type="paragraph" w:styleId="TOC1">
     <w:name w:val="toc 1"/>
-    <w:next w:val="Standard"/>
+    <w:next w:val="Normal"/>
     <w:uiPriority w:val="39"/>
     <w:pPr>
       <w:tabs>
@@ -6886,9 +6726,9 @@
       <w:u w:color="0057A3"/>
     </w:rPr>
   </w:style>
-  <w:style w:type="paragraph" w:styleId="Verzeichnis2">
+  <w:style w:type="paragraph" w:styleId="TOC2">
     <w:name w:val="toc 2"/>
-    <w:next w:val="Standard"/>
+    <w:next w:val="Normal"/>
     <w:uiPriority w:val="39"/>
     <w:pPr>
       <w:tabs>
@@ -6904,9 +6744,9 @@
       <w:u w:color="4CA5FF"/>
     </w:rPr>
   </w:style>
-  <w:style w:type="paragraph" w:styleId="Verzeichnis3">
+  <w:style w:type="paragraph" w:styleId="TOC3">
     <w:name w:val="toc 3"/>
-    <w:next w:val="Standard"/>
+    <w:next w:val="Normal"/>
     <w:uiPriority w:val="39"/>
     <w:pPr>
       <w:tabs>
@@ -6971,10 +6811,10 @@
       <w:u w:val="single"/>
     </w:rPr>
   </w:style>
-  <w:style w:type="paragraph" w:styleId="Verzeichnis4">
+  <w:style w:type="paragraph" w:styleId="TOC4">
     <w:name w:val="toc 4"/>
-    <w:basedOn w:val="Standard"/>
-    <w:next w:val="Standard"/>
+    <w:basedOn w:val="Normal"/>
+    <w:next w:val="Normal"/>
     <w:autoRedefine/>
     <w:semiHidden/>
     <w:rsid w:val="003913BD"/>
@@ -6988,24 +6828,24 @@
       <w:lang w:val="de-DE"/>
     </w:rPr>
   </w:style>
-  <w:style w:type="paragraph" w:styleId="Funotentext">
+  <w:style w:type="paragraph" w:styleId="FootnoteText">
     <w:name w:val="footnote text"/>
-    <w:basedOn w:val="Standard"/>
+    <w:basedOn w:val="Normal"/>
     <w:semiHidden/>
     <w:rPr>
       <w:szCs w:val="20"/>
     </w:rPr>
   </w:style>
-  <w:style w:type="character" w:styleId="Funotenzeichen">
+  <w:style w:type="character" w:styleId="FootnoteReference">
     <w:name w:val="footnote reference"/>
     <w:semiHidden/>
     <w:rPr>
       <w:vertAlign w:val="superscript"/>
     </w:rPr>
   </w:style>
-  <w:style w:type="paragraph" w:styleId="Sprechblasentext">
+  <w:style w:type="paragraph" w:styleId="BalloonText">
     <w:name w:val="Balloon Text"/>
-    <w:basedOn w:val="Standard"/>
+    <w:basedOn w:val="Normal"/>
     <w:semiHidden/>
     <w:rPr>
       <w:rFonts w:ascii="Tahoma" w:hAnsi="Tahoma" w:cs="Tahoma"/>
@@ -7015,7 +6855,7 @@
   </w:style>
   <w:style w:type="paragraph" w:customStyle="1" w:styleId="Tabelle">
     <w:name w:val="Tabelle"/>
-    <w:basedOn w:val="Standard"/>
+    <w:basedOn w:val="Normal"/>
     <w:pPr>
       <w:spacing w:before="20" w:after="20"/>
       <w:jc w:val="both"/>
@@ -7026,10 +6866,10 @@
       <w:lang w:val="de-DE" w:eastAsia="en-US"/>
     </w:rPr>
   </w:style>
-  <w:style w:type="paragraph" w:styleId="Verzeichnis5">
+  <w:style w:type="paragraph" w:styleId="TOC5">
     <w:name w:val="toc 5"/>
-    <w:basedOn w:val="Standard"/>
-    <w:next w:val="Standard"/>
+    <w:basedOn w:val="Normal"/>
+    <w:next w:val="Normal"/>
     <w:autoRedefine/>
     <w:semiHidden/>
     <w:pPr>
@@ -7041,10 +6881,10 @@
       <w:lang w:val="de-DE"/>
     </w:rPr>
   </w:style>
-  <w:style w:type="paragraph" w:styleId="Verzeichnis6">
+  <w:style w:type="paragraph" w:styleId="TOC6">
     <w:name w:val="toc 6"/>
-    <w:basedOn w:val="Standard"/>
-    <w:next w:val="Standard"/>
+    <w:basedOn w:val="Normal"/>
+    <w:next w:val="Normal"/>
     <w:autoRedefine/>
     <w:semiHidden/>
     <w:pPr>
@@ -7056,10 +6896,10 @@
       <w:lang w:val="de-DE"/>
     </w:rPr>
   </w:style>
-  <w:style w:type="paragraph" w:styleId="Verzeichnis7">
+  <w:style w:type="paragraph" w:styleId="TOC7">
     <w:name w:val="toc 7"/>
-    <w:basedOn w:val="Standard"/>
-    <w:next w:val="Standard"/>
+    <w:basedOn w:val="Normal"/>
+    <w:next w:val="Normal"/>
     <w:autoRedefine/>
     <w:semiHidden/>
     <w:pPr>
@@ -7071,10 +6911,10 @@
       <w:lang w:val="de-DE"/>
     </w:rPr>
   </w:style>
-  <w:style w:type="paragraph" w:styleId="Verzeichnis8">
+  <w:style w:type="paragraph" w:styleId="TOC8">
     <w:name w:val="toc 8"/>
-    <w:basedOn w:val="Standard"/>
-    <w:next w:val="Standard"/>
+    <w:basedOn w:val="Normal"/>
+    <w:next w:val="Normal"/>
     <w:autoRedefine/>
     <w:semiHidden/>
     <w:pPr>
@@ -7086,10 +6926,10 @@
       <w:lang w:val="de-DE"/>
     </w:rPr>
   </w:style>
-  <w:style w:type="paragraph" w:styleId="Verzeichnis9">
+  <w:style w:type="paragraph" w:styleId="TOC9">
     <w:name w:val="toc 9"/>
-    <w:basedOn w:val="Standard"/>
-    <w:next w:val="Standard"/>
+    <w:basedOn w:val="Normal"/>
+    <w:next w:val="Normal"/>
     <w:autoRedefine/>
     <w:semiHidden/>
     <w:pPr>
@@ -7103,7 +6943,7 @@
   </w:style>
   <w:style w:type="paragraph" w:customStyle="1" w:styleId="GW002">
     <w:name w:val="GW002"/>
-    <w:basedOn w:val="berschrift1"/>
+    <w:basedOn w:val="Heading1"/>
     <w:next w:val="Text2"/>
     <w:rsid w:val="00C7102A"/>
     <w:pPr>
@@ -7114,7 +6954,7 @@
   </w:style>
   <w:style w:type="paragraph" w:customStyle="1" w:styleId="AufzhlungPunkt">
     <w:name w:val="Aufzählung Punkt"/>
-    <w:basedOn w:val="Standard"/>
+    <w:basedOn w:val="Normal"/>
     <w:rsid w:val="00B606AF"/>
     <w:pPr>
       <w:numPr>
@@ -7134,7 +6974,7 @@
   </w:style>
   <w:style w:type="paragraph" w:customStyle="1" w:styleId="GW001">
     <w:name w:val="GW001"/>
-    <w:basedOn w:val="Standard"/>
+    <w:basedOn w:val="Normal"/>
     <w:rsid w:val="00B606AF"/>
     <w:pPr>
       <w:keepNext/>
@@ -7148,9 +6988,9 @@
       <w:lang w:val="de-DE"/>
     </w:rPr>
   </w:style>
-  <w:style w:type="paragraph" w:styleId="Dokumentstruktur">
+  <w:style w:type="paragraph" w:styleId="DocumentMap">
     <w:name w:val="Document Map"/>
-    <w:basedOn w:val="Standard"/>
+    <w:basedOn w:val="Normal"/>
     <w:semiHidden/>
     <w:rsid w:val="00985C7C"/>
     <w:pPr>
@@ -7162,8 +7002,8 @@
   </w:style>
   <w:style w:type="paragraph" w:customStyle="1" w:styleId="Formatvorlage4">
     <w:name w:val="Formatvorlage4"/>
-    <w:basedOn w:val="Standard"/>
-    <w:next w:val="Verzeichnis1"/>
+    <w:basedOn w:val="Normal"/>
+    <w:next w:val="TOC1"/>
     <w:rsid w:val="00B4042A"/>
     <w:rPr>
       <w:b/>
@@ -7173,7 +7013,7 @@
   </w:style>
   <w:style w:type="numbering" w:customStyle="1" w:styleId="Formatvorlage1">
     <w:name w:val="Formatvorlage1"/>
-    <w:basedOn w:val="KeineListe"/>
+    <w:basedOn w:val="NoList"/>
     <w:rsid w:val="002D4DE8"/>
     <w:pPr>
       <w:numPr>
@@ -7183,8 +7023,8 @@
   </w:style>
   <w:style w:type="paragraph" w:customStyle="1" w:styleId="Content1">
     <w:name w:val="Content 1"/>
-    <w:basedOn w:val="Standard"/>
-    <w:next w:val="Verzeichnis1"/>
+    <w:basedOn w:val="Normal"/>
+    <w:next w:val="TOC1"/>
     <w:rsid w:val="002D4DE8"/>
     <w:pPr>
       <w:ind w:left="180"/>
@@ -7196,8 +7036,8 @@
   </w:style>
   <w:style w:type="paragraph" w:customStyle="1" w:styleId="Content2">
     <w:name w:val="Content 2"/>
-    <w:basedOn w:val="Standard"/>
-    <w:next w:val="Verzeichnis2"/>
+    <w:basedOn w:val="Normal"/>
+    <w:next w:val="TOC2"/>
     <w:rsid w:val="002D4DE8"/>
     <w:pPr>
       <w:ind w:left="708"/>
@@ -7208,7 +7048,7 @@
   </w:style>
   <w:style w:type="numbering" w:customStyle="1" w:styleId="CISLOVANIE">
     <w:name w:val="CISLOVANIE"/>
-    <w:basedOn w:val="KeineListe"/>
+    <w:basedOn w:val="NoList"/>
     <w:rsid w:val="002D4DE8"/>
     <w:pPr>
       <w:numPr>
@@ -7216,15 +7056,15 @@
       </w:numPr>
     </w:pPr>
   </w:style>
-  <w:style w:type="character" w:styleId="Seitenzahl">
+  <w:style w:type="character" w:styleId="PageNumber">
     <w:name w:val="page number"/>
-    <w:basedOn w:val="Absatz-Standardschriftart"/>
+    <w:basedOn w:val="DefaultParagraphFont"/>
     <w:rsid w:val="002D4DE8"/>
   </w:style>
   <w:style w:type="paragraph" w:customStyle="1" w:styleId="Formatvorlage">
     <w:name w:val="Formatvorlage"/>
-    <w:basedOn w:val="Verzeichnis1"/>
-    <w:next w:val="Verzeichnis1"/>
+    <w:basedOn w:val="TOC1"/>
+    <w:next w:val="TOC1"/>
     <w:rsid w:val="002D4DE8"/>
     <w:pPr>
       <w:numPr>
@@ -7249,7 +7089,7 @@
   </w:style>
   <w:style w:type="paragraph" w:customStyle="1" w:styleId="Step">
     <w:name w:val="Step"/>
-    <w:basedOn w:val="Standard"/>
+    <w:basedOn w:val="Normal"/>
     <w:rsid w:val="00343355"/>
     <w:pPr>
       <w:numPr>
@@ -7257,9 +7097,9 @@
       </w:numPr>
     </w:pPr>
   </w:style>
-  <w:style w:type="table" w:styleId="Tabellenraster">
+  <w:style w:type="table" w:styleId="TableGrid">
     <w:name w:val="Table Grid"/>
-    <w:basedOn w:val="NormaleTabelle"/>
+    <w:basedOn w:val="TableNormal"/>
     <w:uiPriority w:val="59"/>
     <w:rsid w:val="00343355"/>
     <w:tblPr>

</xml_diff>